<commit_message>
Table 2 shows Models 1-4 (Model 2 = adiposity + HbA1c + CRP); supplementary tables consolidated to S1-S5 (annotation merged into S1)
Co-Authored-By: Claude Sonnet 5.5 <noreply@anthropic.com>
</commit_message>
<xml_diff>
--- a/publication_package/01_Manuscript/Manuscript.docx
+++ b/publication_package/01_Manuscript/Manuscript.docx
@@ -153,7 +153,7 @@
     </w:p>
     <w:p>
       <w:r>
-        <w:t>Each metabolite was rank-based inverse-normal transformed [27] and then standardised within the complete cases of each model, so hazard ratios (HR) are per 1 SD. Models were adjusted for age, sex, Townsend deprivation index, body mass index, systolic and diastolic blood pressure, smoking status and alcohol drinking status; "prefer not to answer" was set to missing. Metabolite abbreviations and their rule-based classes are listed in Table S2.</w:t>
+        <w:t>Each metabolite was rank-based inverse-normal transformed [27] and then standardised within the complete cases of each model, so hazard ratios (HR) are per 1 SD. Models were adjusted for age, sex, Townsend deprivation index, body mass index, systolic and diastolic blood pressure, smoking status and alcohol drinking status; "prefer not to answer" was set to missing. Metabolite abbreviations and their rule-based classes are listed in Table S1.</w:t>
       </w:r>
     </w:p>
     <w:p>
@@ -192,7 +192,7 @@
     </w:p>
     <w:p>
       <w:r>
-        <w:t>To examine confounding, the primary models were refitted in the same complete-case sample with additional adjustment for waist circumference and body fat percentage (M2a), HbA1c and log-transformed C-reactive protein (M2b), both sets (M2c), prior hospital diagnoses (M3) or all of these (M4). Prior diagnoses recorded before baseline served as proxies for health-care contact and treatment indications: the log number of distinct three-character ICD-10 codes and indicators of disorders of lipoprotein metabolism (E78), ischaemic heart disease (I20–I25), hypertension (I10–I15), diabetes (E10–E14), reflux disease (K20–K22) and gastritis or ulcer (K25–K29). To verify the lipoprotein findings, NMR measures were correlated with clinical-chemistry assays of the same blood sample (HDL and LDL cholesterol, apolipoproteins A1 and B, triglycerides, total cholesterol); the models were refitted with the clinical measures; crude incidence rates were calculated by sex-specific tertiles of HDL cholesterol; the proxies were added stepwise; and HDL cholesterol, LDL cholesterol and triglycerides were fitted together. To assess specificity, the Model 1 scan of all 251 metabolites was repeated for 23 other digestive diseases with at least 2,000 incident events and for colorectal cancer (ICD-10 C18–C20), and the 251 log hazard ratios of each outcome were correlated with the colon and stomach/duodenal polyp profiles. A metabolite risk score was derived as the metabolite part of a penalised Cox model fitted in the 70% training set and evaluated in the independent 30% test set by hazard ratio per SD, quartiles, a trend test across quartile medians and cumulative incidence. Dose–response was examined with four-knot restricted cubic splines (knots at the 5th, 35th, 65th and 95th percentiles) [30] for the three strongest positive and negative metabolites and for glycoprotein acetyls, HDL cholesterol and total triglycerides, with a likelihood-ratio test against a linear term.</w:t>
+        <w:t>To examine confounding, the primary models were refitted in the same complete-case sample with additional adjustment for waist circumference and body fat percentage (Model 2a), HbA1c and log-transformed C-reactive protein (Model 2b), both sets (Model 2), prior hospital diagnoses (Model 3) or all of these (Model 4). Prior diagnoses recorded before baseline served as proxies for health-care contact and treatment indications: the log number of distinct three-character ICD-10 codes and indicators of disorders of lipoprotein metabolism (E78), ischaemic heart disease (I20–I25), hypertension (I10–I15), diabetes (E10–E14), reflux disease (K20–K22) and gastritis or ulcer (K25–K29). To verify the lipoprotein findings, NMR measures were correlated with clinical-chemistry assays of the same blood sample (HDL and LDL cholesterol, apolipoproteins A1 and B, triglycerides, total cholesterol); the models were refitted with the clinical measures; crude incidence rates were calculated by sex-specific tertiles of HDL cholesterol; the proxies were added stepwise; and HDL cholesterol, LDL cholesterol and triglycerides were fitted together. To assess specificity, the Model 1 scan of all 251 metabolites was repeated for 23 other digestive diseases with at least 2,000 incident events and for colorectal cancer (ICD-10 C18–C20), and the 251 log hazard ratios of each outcome were correlated with the colon and stomach/duodenal polyp profiles. A metabolite risk score was derived as the metabolite part of a penalised Cox model fitted in the 70% training set and evaluated in the independent 30% test set by hazard ratio per SD, quartiles, a trend test across quartile medians and cumulative incidence. Dose–response was examined with four-knot restricted cubic splines (knots at the 5th, 35th, 65th and 95th percentiles) [30] for the three strongest positive and negative metabolites and for glycoprotein acetyls, HDL cholesterol and total triglycerides, with a likelihood-ratio test against a linear term.</w:t>
       </w:r>
     </w:p>
     <w:p>
@@ -278,7 +278,7 @@
     </w:p>
     <w:p>
       <w:r>
-        <w:t>In the complete-case sample (240,720 participants with 13,822 colon polyps; 241,891 with 6,370 stomach/duodenal polyps), 145 and 172 metabolites were significant under Model 1. Adding waist circumference and body fat percentage left 117 (81%) and 155 (90%) significant; adding HbA1c and CRP, 122 (84%) and 148 (86%); adding prior hospital diagnoses, 95 (66%) and 119 (69%); and all adjustments together, 55 (38%) and 91 (53%) (Fig. 8, Table 2, Table S1). Under full adjustment the direction of effect was retained for 139 of 145 colon polyp and 172 of 172 stomach/duodenal polyp associations, and the median attenuation of the log hazard ratio was 51% and 45%. In total, 61 and 92 metabolites remained significant. For colon polyp they comprised triglyceride content and share (19 measures), fatty-acid composition (9 measures; proportion of linoleic acid HR 0.93, 0.91–0.95) and glycoprotein acetyls (HR 1.05); for stomach/duodenal polyp, HDL cholesterol and HDL subclass lipids (HDL cholesterol HR 0.90, 0.87–0.93), triglycerides (HR 1.06) and glycoprotein acetyls (HR 1.10). LDL cholesterol, apolipoprotein B and total cholesterol were not significant for either outcome.</w:t>
+        <w:t>In the complete-case sample (240,720 participants with 13,822 colon polyps; 241,891 with 6,370 stomach/duodenal polyps), 145 and 172 metabolites were significant under Model 1. Adding waist circumference and body fat percentage (Model 2a) left 117 (81%) and 155 (90%) significant; adding HbA1c and CRP (Model 2b), 122 (84%) and 148 (86%); adding both sets (Model 2), 88 (61%) and 139 (81%); adding prior hospital diagnoses (Model 3), 95 (66%) and 119 (69%); and all adjustments together (Model 4), 55 (38%) and 91 (53%) (Fig. 8, Table 2, Table S1). Under full adjustment the direction of effect was retained for 139 of 145 colon polyp and 172 of 172 stomach/duodenal polyp associations, and the median attenuation of the log hazard ratio was 51% and 45%. In total, 61 and 92 metabolites remained significant. For colon polyp they comprised triglyceride content and share (19 measures), fatty-acid composition (9 measures; proportion of linoleic acid HR 0.93, 0.91–0.95) and glycoprotein acetyls (HR 1.05); for stomach/duodenal polyp, HDL cholesterol and HDL subclass lipids (HDL cholesterol HR 0.90, 0.87–0.93), triglycerides (HR 1.06) and glycoprotein acetyls (HR 1.10). LDL cholesterol, apolipoprotein B and total cholesterol were not significant for either outcome.</w:t>
       </w:r>
     </w:p>
     <w:p>
@@ -291,7 +291,7 @@
     </w:p>
     <w:p>
       <w:r>
-        <w:t>NMR measures correlated closely with clinical-chemistry assays of the same blood sample (Spearman r 0.92 for HDL cholesterol, 0.88 for LDL cholesterol, 0.86 for apolipoprotein A1, 0.91 for apolipoprotein B and 0.94 for triglycerides). The clinical assays reproduced the associations: for stomach/duodenal polyp the hazard ratio per SD was 0.85 (0.82–0.87) for HDL cholesterol, 0.96 for LDL cholesterol, 0.88 for apolipoprotein A1 and 1.12 for triglycerides (NMR: 0.85, 0.95, 0.89 and 1.10); for colon polyp it was 0.97, 0.96, 0.99 and 1.07 (NMR: 0.98, 0.96, 1.01 and 1.06). The incidence of stomach/duodenal polyp fell from the lowest to the highest sex-specific tertile of HDL cholesterol from 2.71 to 1.78 per 1000 person-years in women and from 2.01 to 1.40 in men. Adjustment for prior hospital diagnoses removed the inverse associations of LDL cholesterol (colon polyp 0.96 to 1.00; stomach/duodenal polyp 0.95 to 1.00) and apolipoprotein B (0.96 to 0.99; 0.97 to 1.02), and the number of prior diagnoses alone accounted for most of the change; participants with a prior diagnosis of a lipoprotein metabolism disorder had LDL cholesterol 0.70 SD and HDL cholesterol 0.51 SD lower than the others. The HDL cholesterol association for colon polyp disappeared (0.98 to 1.00), whereas that for stomach/duodenal polyp persisted (0.85 to 0.88) and was present in women (0.86) and men (0.85) (Fig. S9, Table S6). With HDL cholesterol, LDL cholesterol and triglycerides in one model together with the proxies, triglycerides remained associated with both outcomes (HR 1.08 and 1.06), HDL cholesterol with stomach/duodenal polyp (0.90), and LDL cholesterol stayed weakly inverse for colon polyp (0.97).</w:t>
+        <w:t>NMR measures correlated closely with clinical-chemistry assays of the same blood sample (Spearman r 0.92 for HDL cholesterol, 0.88 for LDL cholesterol, 0.86 for apolipoprotein A1, 0.91 for apolipoprotein B and 0.94 for triglycerides). The clinical assays reproduced the associations: for stomach/duodenal polyp the hazard ratio per SD was 0.85 (0.82–0.87) for HDL cholesterol, 0.96 for LDL cholesterol, 0.88 for apolipoprotein A1 and 1.12 for triglycerides (NMR: 0.85, 0.95, 0.89 and 1.10); for colon polyp it was 0.97, 0.96, 0.99 and 1.07 (NMR: 0.98, 0.96, 1.01 and 1.06). The incidence of stomach/duodenal polyp fell from the lowest to the highest sex-specific tertile of HDL cholesterol from 2.71 to 1.78 per 1000 person-years in women and from 2.01 to 1.40 in men. Adjustment for prior hospital diagnoses removed the inverse associations of LDL cholesterol (colon polyp 0.96 to 1.00; stomach/duodenal polyp 0.95 to 1.00) and apolipoprotein B (0.96 to 0.99; 0.97 to 1.02), and the number of prior diagnoses alone accounted for most of the change; participants with a prior diagnosis of a lipoprotein metabolism disorder had LDL cholesterol 0.70 SD and HDL cholesterol 0.51 SD lower than the others. The HDL cholesterol association for colon polyp disappeared (0.98 to 1.00), whereas that for stomach/duodenal polyp persisted (0.85 to 0.88) and was present in women (0.86) and men (0.85) (Fig. S9, Table S5). With HDL cholesterol, LDL cholesterol and triglycerides in one model together with the proxies, triglycerides remained associated with both outcomes (HR 1.08 and 1.06), HDL cholesterol with stomach/duodenal polyp (0.90), and LDL cholesterol stayed weakly inverse for colon polyp (0.97).</w:t>
       </w:r>
     </w:p>
     <w:p>
@@ -304,7 +304,7 @@
     </w:p>
     <w:p>
       <w:r>
-        <w:t>The metabolite profile of both polyp types resembled that of many other digestive diseases (Fig. 9, Tables S4–S5). The correlation between the 251 log hazard ratios for colon polyp and those for another outcome was 0.88–0.93 for 12 of 24 outcomes, including diverticular disease, anorectal diseases, gastritis, liver disease, haemorrhoids and irritable bowel syndrome; for stomach/duodenal polyp it was 0.93–0.97 for reflux, hiatus hernia, gallstones, peritoneal disorders, diverticular disease and irritable bowel syndrome. Colorectal cancer showed a similar but weaker profile (r = 0.76 and 0.57), with 4 metabolites significant after correction. Inguinal hernia had an inverse profile (r = −0.88 and −0.69) and umbilical hernia a weak one (0.43 and 0.56). Glycoprotein acetyls had a positive association with every outcome.</w:t>
+        <w:t>The metabolite profile of both polyp types resembled that of many other digestive diseases (Fig. 9, Tables S3–S4). The correlation between the 251 log hazard ratios for colon polyp and those for another outcome was 0.88–0.93 for 12 of 24 outcomes, including diverticular disease, anorectal diseases, gastritis, liver disease, haemorrhoids and irritable bowel syndrome; for stomach/duodenal polyp it was 0.93–0.97 for reflux, hiatus hernia, gallstones, peritoneal disorders, diverticular disease and irritable bowel syndrome. Colorectal cancer showed a similar but weaker profile (r = 0.76 and 0.57), with 4 metabolites significant after correction. Inguinal hernia had an inverse profile (r = −0.88 and −0.69) and umbilical hernia a weak one (0.43 and 0.56). Glycoprotein acetyls had a positive association with every outcome.</w:t>
       </w:r>
     </w:p>
     <w:p>
@@ -330,7 +330,7 @@
     </w:p>
     <w:p>
       <w:r>
-        <w:t>Adding metabolites to the covariates changed discrimination little (Fig. 7, Fig. S6, Table S3). For colon polyp, AUC rose from 0.626–0.627 to 0.630–0.631, the C-index from 0.630 to 0.636, and the 5- and 10-year time-dependent AUC from 0.676 to 0.682 and from 0.648 to 0.656. For stomach/duodenal polyp, AUC rose from 0.627–0.632 to 0.636–0.647, the C-index from 0.634–0.635 to 0.647–0.651, and the 5- and 10-year AUC from 0.656 to 0.681 and from 0.650 to 0.667. Overall discrimination remained low (AUC and C-index up to 0.65 in the main analyses; time-dependent AUC up to 0.68), and the Bonferroni-selected set performed like the full set of 251 metabolites.</w:t>
+        <w:t>Adding metabolites to the covariates changed discrimination little (Fig. 7, Fig. S6, Table S2). For colon polyp, AUC rose from 0.626–0.627 to 0.630–0.631, the C-index from 0.630 to 0.636, and the 5- and 10-year time-dependent AUC from 0.676 to 0.682 and from 0.648 to 0.656. For stomach/duodenal polyp, AUC rose from 0.627–0.632 to 0.636–0.647, the C-index from 0.634–0.635 to 0.647–0.651, and the 5- and 10-year AUC from 0.656 to 0.681 and from 0.650 to 0.667. Overall discrimination remained low (AUC and C-index up to 0.65 in the main analyses; time-dependent AUC up to 0.68), and the Bonferroni-selected set performed like the full set of 251 metabolites.</w:t>
       </w:r>
     </w:p>
     <w:p>
@@ -5926,18 +5926,20 @@
         <w:tblLook w:firstColumn="1" w:firstRow="1" w:lastColumn="0" w:lastRow="0" w:noHBand="0" w:noVBand="1" w:val="04A0"/>
       </w:tblPr>
       <w:tblGrid>
-        <w:gridCol w:w="1971"/>
-        <w:gridCol w:w="1971"/>
-        <w:gridCol w:w="1971"/>
-        <w:gridCol w:w="1971"/>
-        <w:gridCol w:w="1971"/>
-        <w:gridCol w:w="1971"/>
-        <w:gridCol w:w="1971"/>
+        <w:gridCol w:w="1533"/>
+        <w:gridCol w:w="1533"/>
+        <w:gridCol w:w="1533"/>
+        <w:gridCol w:w="1533"/>
+        <w:gridCol w:w="1533"/>
+        <w:gridCol w:w="1533"/>
+        <w:gridCol w:w="1533"/>
+        <w:gridCol w:w="1533"/>
+        <w:gridCol w:w="1533"/>
       </w:tblGrid>
       <w:tr>
         <w:tc>
           <w:tcPr>
-            <w:tcW w:type="dxa" w:w="3969"/>
+            <w:tcW w:type="dxa" w:w="3402"/>
             <w:tcBorders>
               <w:top w:val="single" w:sz="12" w:space="0" w:color="000000"/>
             </w:tcBorders>
@@ -5955,7 +5957,7 @@
             <w:r>
               <w:rPr>
                 <w:b/>
-                <w:sz w:val="16"/>
+                <w:sz w:val="15"/>
               </w:rPr>
               <w:t>Metabolite</w:t>
             </w:r>
@@ -5963,8 +5965,8 @@
         </w:tc>
         <w:tc>
           <w:tcPr>
-            <w:tcW w:type="dxa" w:w="5103"/>
-            <w:gridSpan w:val="3"/>
+            <w:tcW w:type="dxa" w:w="5668"/>
+            <w:gridSpan w:val="4"/>
             <w:tcBorders>
               <w:top w:val="single" w:sz="12" w:space="0" w:color="000000"/>
             </w:tcBorders>
@@ -5982,7 +5984,7 @@
             <w:r>
               <w:rPr>
                 <w:b/>
-                <w:sz w:val="16"/>
+                <w:sz w:val="15"/>
               </w:rPr>
               <w:t>Colon polyp (K63.5)</w:t>
             </w:r>
@@ -6009,11 +6011,22 @@
               </w:rPr>
             </w:r>
           </w:p>
-        </w:tc>
-        <w:tc>
-          <w:tcPr>
-            <w:tcW w:type="dxa" w:w="5103"/>
-            <w:gridSpan w:val="3"/>
+          <w:p>
+            <w:pPr>
+              <w:spacing w:after="0" w:line="240" w:lineRule="auto"/>
+              <w:jc w:val="center"/>
+            </w:pPr>
+            <w:r>
+              <w:rPr>
+                <w:b/>
+              </w:rPr>
+            </w:r>
+          </w:p>
+        </w:tc>
+        <w:tc>
+          <w:tcPr>
+            <w:tcW w:type="dxa" w:w="5668"/>
+            <w:gridSpan w:val="4"/>
             <w:tcBorders>
               <w:top w:val="single" w:sz="12" w:space="0" w:color="000000"/>
             </w:tcBorders>
@@ -6031,9 +6044,20 @@
             <w:r>
               <w:rPr>
                 <w:b/>
-                <w:sz w:val="16"/>
+                <w:sz w:val="15"/>
               </w:rPr>
               <w:t>Stomach/duodenal polyp (K31.7)</w:t>
+            </w:r>
+          </w:p>
+          <w:p>
+            <w:pPr>
+              <w:spacing w:after="0" w:line="240" w:lineRule="auto"/>
+              <w:jc w:val="center"/>
+            </w:pPr>
+            <w:r>
+              <w:rPr>
+                <w:b/>
+              </w:rPr>
             </w:r>
           </w:p>
           <w:p>
@@ -6063,7 +6087,7 @@
       <w:tr>
         <w:tc>
           <w:tcPr>
-            <w:tcW w:type="dxa" w:w="3969"/>
+            <w:tcW w:type="dxa" w:w="3402"/>
             <w:tcBorders>
               <w:bottom w:val="single" w:sz="6" w:space="0" w:color="000000"/>
             </w:tcBorders>
@@ -6082,7 +6106,7 @@
         </w:tc>
         <w:tc>
           <w:tcPr>
-            <w:tcW w:type="dxa" w:w="1701"/>
+            <w:tcW w:type="dxa" w:w="1417"/>
             <w:tcBorders>
               <w:bottom w:val="single" w:sz="6" w:space="0" w:color="000000"/>
             </w:tcBorders>
@@ -6100,7 +6124,7 @@
             <w:r>
               <w:rPr>
                 <w:b/>
-                <w:sz w:val="16"/>
+                <w:sz w:val="15"/>
               </w:rPr>
               <w:t>Model 1</w:t>
             </w:r>
@@ -6108,7 +6132,7 @@
         </w:tc>
         <w:tc>
           <w:tcPr>
-            <w:tcW w:type="dxa" w:w="1701"/>
+            <w:tcW w:type="dxa" w:w="1417"/>
             <w:tcBorders>
               <w:bottom w:val="single" w:sz="6" w:space="0" w:color="000000"/>
             </w:tcBorders>
@@ -6126,15 +6150,15 @@
             <w:r>
               <w:rPr>
                 <w:b/>
-                <w:sz w:val="16"/>
-              </w:rPr>
-              <w:t>Model 3</w:t>
-            </w:r>
-          </w:p>
-        </w:tc>
-        <w:tc>
-          <w:tcPr>
-            <w:tcW w:type="dxa" w:w="1701"/>
+                <w:sz w:val="15"/>
+              </w:rPr>
+              <w:t>Model 2</w:t>
+            </w:r>
+          </w:p>
+        </w:tc>
+        <w:tc>
+          <w:tcPr>
+            <w:tcW w:type="dxa" w:w="1417"/>
             <w:tcBorders>
               <w:bottom w:val="single" w:sz="6" w:space="0" w:color="000000"/>
             </w:tcBorders>
@@ -6152,15 +6176,15 @@
             <w:r>
               <w:rPr>
                 <w:b/>
-                <w:sz w:val="16"/>
-              </w:rPr>
-              <w:t>Model 4</w:t>
-            </w:r>
-          </w:p>
-        </w:tc>
-        <w:tc>
-          <w:tcPr>
-            <w:tcW w:type="dxa" w:w="1701"/>
+                <w:sz w:val="15"/>
+              </w:rPr>
+              <w:t>Model 3</w:t>
+            </w:r>
+          </w:p>
+        </w:tc>
+        <w:tc>
+          <w:tcPr>
+            <w:tcW w:type="dxa" w:w="1417"/>
             <w:tcBorders>
               <w:bottom w:val="single" w:sz="6" w:space="0" w:color="000000"/>
             </w:tcBorders>
@@ -6178,15 +6202,15 @@
             <w:r>
               <w:rPr>
                 <w:b/>
-                <w:sz w:val="16"/>
-              </w:rPr>
-              <w:t>Model 1</w:t>
-            </w:r>
-          </w:p>
-        </w:tc>
-        <w:tc>
-          <w:tcPr>
-            <w:tcW w:type="dxa" w:w="1701"/>
+                <w:sz w:val="15"/>
+              </w:rPr>
+              <w:t>Model 4</w:t>
+            </w:r>
+          </w:p>
+        </w:tc>
+        <w:tc>
+          <w:tcPr>
+            <w:tcW w:type="dxa" w:w="1417"/>
             <w:tcBorders>
               <w:bottom w:val="single" w:sz="6" w:space="0" w:color="000000"/>
             </w:tcBorders>
@@ -6204,15 +6228,15 @@
             <w:r>
               <w:rPr>
                 <w:b/>
-                <w:sz w:val="16"/>
-              </w:rPr>
-              <w:t>Model 3</w:t>
-            </w:r>
-          </w:p>
-        </w:tc>
-        <w:tc>
-          <w:tcPr>
-            <w:tcW w:type="dxa" w:w="1701"/>
+                <w:sz w:val="15"/>
+              </w:rPr>
+              <w:t>Model 1</w:t>
+            </w:r>
+          </w:p>
+        </w:tc>
+        <w:tc>
+          <w:tcPr>
+            <w:tcW w:type="dxa" w:w="1417"/>
             <w:tcBorders>
               <w:bottom w:val="single" w:sz="6" w:space="0" w:color="000000"/>
             </w:tcBorders>
@@ -6230,7 +6254,59 @@
             <w:r>
               <w:rPr>
                 <w:b/>
-                <w:sz w:val="16"/>
+                <w:sz w:val="15"/>
+              </w:rPr>
+              <w:t>Model 2</w:t>
+            </w:r>
+          </w:p>
+        </w:tc>
+        <w:tc>
+          <w:tcPr>
+            <w:tcW w:type="dxa" w:w="1417"/>
+            <w:tcBorders>
+              <w:bottom w:val="single" w:sz="6" w:space="0" w:color="000000"/>
+            </w:tcBorders>
+          </w:tcPr>
+          <w:p>
+            <w:pPr>
+              <w:spacing w:after="0" w:line="240" w:lineRule="auto"/>
+              <w:jc w:val="center"/>
+            </w:pPr>
+            <w:r>
+              <w:rPr>
+                <w:b/>
+              </w:rPr>
+            </w:r>
+            <w:r>
+              <w:rPr>
+                <w:b/>
+                <w:sz w:val="15"/>
+              </w:rPr>
+              <w:t>Model 3</w:t>
+            </w:r>
+          </w:p>
+        </w:tc>
+        <w:tc>
+          <w:tcPr>
+            <w:tcW w:type="dxa" w:w="1417"/>
+            <w:tcBorders>
+              <w:bottom w:val="single" w:sz="6" w:space="0" w:color="000000"/>
+            </w:tcBorders>
+          </w:tcPr>
+          <w:p>
+            <w:pPr>
+              <w:spacing w:after="0" w:line="240" w:lineRule="auto"/>
+              <w:jc w:val="center"/>
+            </w:pPr>
+            <w:r>
+              <w:rPr>
+                <w:b/>
+              </w:rPr>
+            </w:r>
+            <w:r>
+              <w:rPr>
+                <w:b/>
+                <w:sz w:val="15"/>
               </w:rPr>
               <w:t>Model 4</w:t>
             </w:r>
@@ -6240,7 +6316,7 @@
       <w:tr>
         <w:tc>
           <w:tcPr>
-            <w:tcW w:type="dxa" w:w="3969"/>
+            <w:tcW w:type="dxa" w:w="3402"/>
           </w:tcPr>
           <w:p>
             <w:pPr>
@@ -6254,7 +6330,7 @@
             <w:r>
               <w:rPr>
                 <w:b/>
-                <w:sz w:val="16"/>
+                <w:sz w:val="15"/>
               </w:rPr>
               <w:t>Lipids and lipoproteins</w:t>
             </w:r>
@@ -6262,7 +6338,7 @@
         </w:tc>
         <w:tc>
           <w:tcPr>
-            <w:tcW w:type="dxa" w:w="1701"/>
+            <w:tcW w:type="dxa" w:w="1417"/>
           </w:tcPr>
           <w:p>
             <w:pPr>
@@ -6278,7 +6354,7 @@
         </w:tc>
         <w:tc>
           <w:tcPr>
-            <w:tcW w:type="dxa" w:w="1701"/>
+            <w:tcW w:type="dxa" w:w="1417"/>
           </w:tcPr>
           <w:p>
             <w:pPr>
@@ -6294,7 +6370,7 @@
         </w:tc>
         <w:tc>
           <w:tcPr>
-            <w:tcW w:type="dxa" w:w="1701"/>
+            <w:tcW w:type="dxa" w:w="1417"/>
           </w:tcPr>
           <w:p>
             <w:pPr>
@@ -6310,7 +6386,7 @@
         </w:tc>
         <w:tc>
           <w:tcPr>
-            <w:tcW w:type="dxa" w:w="1701"/>
+            <w:tcW w:type="dxa" w:w="1417"/>
           </w:tcPr>
           <w:p>
             <w:pPr>
@@ -6326,7 +6402,7 @@
         </w:tc>
         <w:tc>
           <w:tcPr>
-            <w:tcW w:type="dxa" w:w="1701"/>
+            <w:tcW w:type="dxa" w:w="1417"/>
           </w:tcPr>
           <w:p>
             <w:pPr>
@@ -6342,7 +6418,39 @@
         </w:tc>
         <w:tc>
           <w:tcPr>
-            <w:tcW w:type="dxa" w:w="1701"/>
+            <w:tcW w:type="dxa" w:w="1417"/>
+          </w:tcPr>
+          <w:p>
+            <w:pPr>
+              <w:spacing w:after="0" w:line="240" w:lineRule="auto"/>
+              <w:jc w:val="center"/>
+            </w:pPr>
+            <w:r>
+              <w:rPr>
+                <w:b/>
+              </w:rPr>
+            </w:r>
+          </w:p>
+        </w:tc>
+        <w:tc>
+          <w:tcPr>
+            <w:tcW w:type="dxa" w:w="1417"/>
+          </w:tcPr>
+          <w:p>
+            <w:pPr>
+              <w:spacing w:after="0" w:line="240" w:lineRule="auto"/>
+              <w:jc w:val="center"/>
+            </w:pPr>
+            <w:r>
+              <w:rPr>
+                <w:b/>
+              </w:rPr>
+            </w:r>
+          </w:p>
+        </w:tc>
+        <w:tc>
+          <w:tcPr>
+            <w:tcW w:type="dxa" w:w="1417"/>
           </w:tcPr>
           <w:p>
             <w:pPr>
@@ -6360,7 +6468,7 @@
       <w:tr>
         <w:tc>
           <w:tcPr>
-            <w:tcW w:type="dxa" w:w="3969"/>
+            <w:tcW w:type="dxa" w:w="3402"/>
           </w:tcPr>
           <w:p>
             <w:pPr>
@@ -6370,7 +6478,7 @@
             <w:r/>
             <w:r>
               <w:rPr>
-                <w:sz w:val="16"/>
+                <w:sz w:val="15"/>
               </w:rPr>
               <w:t>Total triglycerides</w:t>
             </w:r>
@@ -6378,7 +6486,7 @@
         </w:tc>
         <w:tc>
           <w:tcPr>
-            <w:tcW w:type="dxa" w:w="1701"/>
+            <w:tcW w:type="dxa" w:w="1417"/>
           </w:tcPr>
           <w:p>
             <w:pPr>
@@ -6393,7 +6501,7 @@
             <w:r>
               <w:rPr>
                 <w:b/>
-                <w:sz w:val="16"/>
+                <w:sz w:val="15"/>
               </w:rPr>
               <w:t>1.05 (1.03–1.07)</w:t>
             </w:r>
@@ -6401,7 +6509,25 @@
         </w:tc>
         <w:tc>
           <w:tcPr>
-            <w:tcW w:type="dxa" w:w="1701"/>
+            <w:tcW w:type="dxa" w:w="1417"/>
+          </w:tcPr>
+          <w:p>
+            <w:pPr>
+              <w:spacing w:after="0" w:line="240" w:lineRule="auto"/>
+              <w:jc w:val="center"/>
+            </w:pPr>
+            <w:r/>
+            <w:r>
+              <w:rPr>
+                <w:sz w:val="15"/>
+              </w:rPr>
+              <w:t>1.03 (1.01–1.05)</w:t>
+            </w:r>
+          </w:p>
+        </w:tc>
+        <w:tc>
+          <w:tcPr>
+            <w:tcW w:type="dxa" w:w="1417"/>
           </w:tcPr>
           <w:p>
             <w:pPr>
@@ -6416,7 +6542,7 @@
             <w:r>
               <w:rPr>
                 <w:b/>
-                <w:sz w:val="16"/>
+                <w:sz w:val="15"/>
               </w:rPr>
               <w:t>1.05 (1.03–1.07)</w:t>
             </w:r>
@@ -6424,7 +6550,7 @@
         </w:tc>
         <w:tc>
           <w:tcPr>
-            <w:tcW w:type="dxa" w:w="1701"/>
+            <w:tcW w:type="dxa" w:w="1417"/>
           </w:tcPr>
           <w:p>
             <w:pPr>
@@ -6439,7 +6565,7 @@
             <w:r>
               <w:rPr>
                 <w:b/>
-                <w:sz w:val="16"/>
+                <w:sz w:val="15"/>
               </w:rPr>
               <w:t>1.04 (1.02–1.06)</w:t>
             </w:r>
@@ -6447,7 +6573,7 @@
         </w:tc>
         <w:tc>
           <w:tcPr>
-            <w:tcW w:type="dxa" w:w="1701"/>
+            <w:tcW w:type="dxa" w:w="1417"/>
           </w:tcPr>
           <w:p>
             <w:pPr>
@@ -6462,7 +6588,7 @@
             <w:r>
               <w:rPr>
                 <w:b/>
-                <w:sz w:val="16"/>
+                <w:sz w:val="15"/>
               </w:rPr>
               <w:t>1.10 (1.07–1.13)</w:t>
             </w:r>
@@ -6470,7 +6596,7 @@
         </w:tc>
         <w:tc>
           <w:tcPr>
-            <w:tcW w:type="dxa" w:w="1701"/>
+            <w:tcW w:type="dxa" w:w="1417"/>
           </w:tcPr>
           <w:p>
             <w:pPr>
@@ -6485,7 +6611,30 @@
             <w:r>
               <w:rPr>
                 <w:b/>
-                <w:sz w:val="16"/>
+                <w:sz w:val="15"/>
+              </w:rPr>
+              <w:t>1.07 (1.04–1.10)</w:t>
+            </w:r>
+          </w:p>
+        </w:tc>
+        <w:tc>
+          <w:tcPr>
+            <w:tcW w:type="dxa" w:w="1417"/>
+          </w:tcPr>
+          <w:p>
+            <w:pPr>
+              <w:spacing w:after="0" w:line="240" w:lineRule="auto"/>
+              <w:jc w:val="center"/>
+            </w:pPr>
+            <w:r>
+              <w:rPr>
+                <w:b/>
+              </w:rPr>
+            </w:r>
+            <w:r>
+              <w:rPr>
+                <w:b/>
+                <w:sz w:val="15"/>
               </w:rPr>
               <w:t>1.09 (1.06–1.12)</w:t>
             </w:r>
@@ -6493,7 +6642,7 @@
         </w:tc>
         <w:tc>
           <w:tcPr>
-            <w:tcW w:type="dxa" w:w="1701"/>
+            <w:tcW w:type="dxa" w:w="1417"/>
           </w:tcPr>
           <w:p>
             <w:pPr>
@@ -6508,7 +6657,7 @@
             <w:r>
               <w:rPr>
                 <w:b/>
-                <w:sz w:val="16"/>
+                <w:sz w:val="15"/>
               </w:rPr>
               <w:t>1.06 (1.03–1.09)</w:t>
             </w:r>
@@ -6518,7 +6667,7 @@
       <w:tr>
         <w:tc>
           <w:tcPr>
-            <w:tcW w:type="dxa" w:w="3969"/>
+            <w:tcW w:type="dxa" w:w="3402"/>
           </w:tcPr>
           <w:p>
             <w:pPr>
@@ -6528,7 +6677,7 @@
             <w:r/>
             <w:r>
               <w:rPr>
-                <w:sz w:val="16"/>
+                <w:sz w:val="15"/>
               </w:rPr>
               <w:t>HDL cholesterol</w:t>
             </w:r>
@@ -6536,7 +6685,7 @@
         </w:tc>
         <w:tc>
           <w:tcPr>
-            <w:tcW w:type="dxa" w:w="1701"/>
+            <w:tcW w:type="dxa" w:w="1417"/>
           </w:tcPr>
           <w:p>
             <w:pPr>
@@ -6546,7 +6695,7 @@
             <w:r/>
             <w:r>
               <w:rPr>
-                <w:sz w:val="16"/>
+                <w:sz w:val="15"/>
               </w:rPr>
               <w:t>0.98 (0.96–1.00)</w:t>
             </w:r>
@@ -6554,7 +6703,7 @@
         </w:tc>
         <w:tc>
           <w:tcPr>
-            <w:tcW w:type="dxa" w:w="1701"/>
+            <w:tcW w:type="dxa" w:w="1417"/>
           </w:tcPr>
           <w:p>
             <w:pPr>
@@ -6564,7 +6713,7 @@
             <w:r/>
             <w:r>
               <w:rPr>
-                <w:sz w:val="16"/>
+                <w:sz w:val="15"/>
               </w:rPr>
               <w:t>1.00 (0.98–1.02)</w:t>
             </w:r>
@@ -6572,7 +6721,7 @@
         </w:tc>
         <w:tc>
           <w:tcPr>
-            <w:tcW w:type="dxa" w:w="1701"/>
+            <w:tcW w:type="dxa" w:w="1417"/>
           </w:tcPr>
           <w:p>
             <w:pPr>
@@ -6582,7 +6731,25 @@
             <w:r/>
             <w:r>
               <w:rPr>
-                <w:sz w:val="16"/>
+                <w:sz w:val="15"/>
+              </w:rPr>
+              <w:t>1.00 (0.98–1.02)</w:t>
+            </w:r>
+          </w:p>
+        </w:tc>
+        <w:tc>
+          <w:tcPr>
+            <w:tcW w:type="dxa" w:w="1417"/>
+          </w:tcPr>
+          <w:p>
+            <w:pPr>
+              <w:spacing w:after="0" w:line="240" w:lineRule="auto"/>
+              <w:jc w:val="center"/>
+            </w:pPr>
+            <w:r/>
+            <w:r>
+              <w:rPr>
+                <w:sz w:val="15"/>
               </w:rPr>
               <w:t>1.02 (1.00–1.04)</w:t>
             </w:r>
@@ -6590,7 +6757,7 @@
         </w:tc>
         <w:tc>
           <w:tcPr>
-            <w:tcW w:type="dxa" w:w="1701"/>
+            <w:tcW w:type="dxa" w:w="1417"/>
           </w:tcPr>
           <w:p>
             <w:pPr>
@@ -6605,7 +6772,7 @@
             <w:r>
               <w:rPr>
                 <w:b/>
-                <w:sz w:val="16"/>
+                <w:sz w:val="15"/>
               </w:rPr>
               <w:t>0.84 (0.82–0.87)</w:t>
             </w:r>
@@ -6613,7 +6780,7 @@
         </w:tc>
         <w:tc>
           <w:tcPr>
-            <w:tcW w:type="dxa" w:w="1701"/>
+            <w:tcW w:type="dxa" w:w="1417"/>
           </w:tcPr>
           <w:p>
             <w:pPr>
@@ -6628,7 +6795,30 @@
             <w:r>
               <w:rPr>
                 <w:b/>
-                <w:sz w:val="16"/>
+                <w:sz w:val="15"/>
+              </w:rPr>
+              <w:t>0.87 (0.84–0.90)</w:t>
+            </w:r>
+          </w:p>
+        </w:tc>
+        <w:tc>
+          <w:tcPr>
+            <w:tcW w:type="dxa" w:w="1417"/>
+          </w:tcPr>
+          <w:p>
+            <w:pPr>
+              <w:spacing w:after="0" w:line="240" w:lineRule="auto"/>
+              <w:jc w:val="center"/>
+            </w:pPr>
+            <w:r>
+              <w:rPr>
+                <w:b/>
+              </w:rPr>
+            </w:r>
+            <w:r>
+              <w:rPr>
+                <w:b/>
+                <w:sz w:val="15"/>
               </w:rPr>
               <w:t>0.88 (0.86–0.91)</w:t>
             </w:r>
@@ -6636,7 +6826,7 @@
         </w:tc>
         <w:tc>
           <w:tcPr>
-            <w:tcW w:type="dxa" w:w="1701"/>
+            <w:tcW w:type="dxa" w:w="1417"/>
           </w:tcPr>
           <w:p>
             <w:pPr>
@@ -6651,7 +6841,7 @@
             <w:r>
               <w:rPr>
                 <w:b/>
-                <w:sz w:val="16"/>
+                <w:sz w:val="15"/>
               </w:rPr>
               <w:t>0.90 (0.87–0.93)</w:t>
             </w:r>
@@ -6661,7 +6851,7 @@
       <w:tr>
         <w:tc>
           <w:tcPr>
-            <w:tcW w:type="dxa" w:w="3969"/>
+            <w:tcW w:type="dxa" w:w="3402"/>
           </w:tcPr>
           <w:p>
             <w:pPr>
@@ -6671,7 +6861,7 @@
             <w:r/>
             <w:r>
               <w:rPr>
-                <w:sz w:val="16"/>
+                <w:sz w:val="15"/>
               </w:rPr>
               <w:t>Apolipoprotein A1</w:t>
             </w:r>
@@ -6679,7 +6869,7 @@
         </w:tc>
         <w:tc>
           <w:tcPr>
-            <w:tcW w:type="dxa" w:w="1701"/>
+            <w:tcW w:type="dxa" w:w="1417"/>
           </w:tcPr>
           <w:p>
             <w:pPr>
@@ -6689,7 +6879,7 @@
             <w:r/>
             <w:r>
               <w:rPr>
-                <w:sz w:val="16"/>
+                <w:sz w:val="15"/>
               </w:rPr>
               <w:t>1.01 (0.99–1.03)</w:t>
             </w:r>
@@ -6697,7 +6887,7 @@
         </w:tc>
         <w:tc>
           <w:tcPr>
-            <w:tcW w:type="dxa" w:w="1701"/>
+            <w:tcW w:type="dxa" w:w="1417"/>
           </w:tcPr>
           <w:p>
             <w:pPr>
@@ -6707,7 +6897,7 @@
             <w:r/>
             <w:r>
               <w:rPr>
-                <w:sz w:val="16"/>
+                <w:sz w:val="15"/>
               </w:rPr>
               <w:t>1.02 (1.00–1.04)</w:t>
             </w:r>
@@ -6715,7 +6905,7 @@
         </w:tc>
         <w:tc>
           <w:tcPr>
-            <w:tcW w:type="dxa" w:w="1701"/>
+            <w:tcW w:type="dxa" w:w="1417"/>
           </w:tcPr>
           <w:p>
             <w:pPr>
@@ -6725,7 +6915,25 @@
             <w:r/>
             <w:r>
               <w:rPr>
-                <w:sz w:val="16"/>
+                <w:sz w:val="15"/>
+              </w:rPr>
+              <w:t>1.02 (1.00–1.04)</w:t>
+            </w:r>
+          </w:p>
+        </w:tc>
+        <w:tc>
+          <w:tcPr>
+            <w:tcW w:type="dxa" w:w="1417"/>
+          </w:tcPr>
+          <w:p>
+            <w:pPr>
+              <w:spacing w:after="0" w:line="240" w:lineRule="auto"/>
+              <w:jc w:val="center"/>
+            </w:pPr>
+            <w:r/>
+            <w:r>
+              <w:rPr>
+                <w:sz w:val="15"/>
               </w:rPr>
               <w:t>1.03 (1.01–1.05)</w:t>
             </w:r>
@@ -6733,7 +6941,7 @@
         </w:tc>
         <w:tc>
           <w:tcPr>
-            <w:tcW w:type="dxa" w:w="1701"/>
+            <w:tcW w:type="dxa" w:w="1417"/>
           </w:tcPr>
           <w:p>
             <w:pPr>
@@ -6748,7 +6956,7 @@
             <w:r>
               <w:rPr>
                 <w:b/>
-                <w:sz w:val="16"/>
+                <w:sz w:val="15"/>
               </w:rPr>
               <w:t>0.88 (0.86–0.91)</w:t>
             </w:r>
@@ -6756,7 +6964,7 @@
         </w:tc>
         <w:tc>
           <w:tcPr>
-            <w:tcW w:type="dxa" w:w="1701"/>
+            <w:tcW w:type="dxa" w:w="1417"/>
           </w:tcPr>
           <w:p>
             <w:pPr>
@@ -6771,7 +6979,30 @@
             <w:r>
               <w:rPr>
                 <w:b/>
-                <w:sz w:val="16"/>
+                <w:sz w:val="15"/>
+              </w:rPr>
+              <w:t>0.90 (0.88–0.93)</w:t>
+            </w:r>
+          </w:p>
+        </w:tc>
+        <w:tc>
+          <w:tcPr>
+            <w:tcW w:type="dxa" w:w="1417"/>
+          </w:tcPr>
+          <w:p>
+            <w:pPr>
+              <w:spacing w:after="0" w:line="240" w:lineRule="auto"/>
+              <w:jc w:val="center"/>
+            </w:pPr>
+            <w:r>
+              <w:rPr>
+                <w:b/>
+              </w:rPr>
+            </w:r>
+            <w:r>
+              <w:rPr>
+                <w:b/>
+                <w:sz w:val="15"/>
               </w:rPr>
               <w:t>0.91 (0.89–0.94)</w:t>
             </w:r>
@@ -6779,7 +7010,7 @@
         </w:tc>
         <w:tc>
           <w:tcPr>
-            <w:tcW w:type="dxa" w:w="1701"/>
+            <w:tcW w:type="dxa" w:w="1417"/>
           </w:tcPr>
           <w:p>
             <w:pPr>
@@ -6794,7 +7025,7 @@
             <w:r>
               <w:rPr>
                 <w:b/>
-                <w:sz w:val="16"/>
+                <w:sz w:val="15"/>
               </w:rPr>
               <w:t>0.92 (0.90–0.95)</w:t>
             </w:r>
@@ -6804,7 +7035,7 @@
       <w:tr>
         <w:tc>
           <w:tcPr>
-            <w:tcW w:type="dxa" w:w="3969"/>
+            <w:tcW w:type="dxa" w:w="3402"/>
           </w:tcPr>
           <w:p>
             <w:pPr>
@@ -6814,7 +7045,7 @@
             <w:r/>
             <w:r>
               <w:rPr>
-                <w:sz w:val="16"/>
+                <w:sz w:val="15"/>
               </w:rPr>
               <w:t>LDL cholesterol</w:t>
             </w:r>
@@ -6822,7 +7053,7 @@
         </w:tc>
         <w:tc>
           <w:tcPr>
-            <w:tcW w:type="dxa" w:w="1701"/>
+            <w:tcW w:type="dxa" w:w="1417"/>
           </w:tcPr>
           <w:p>
             <w:pPr>
@@ -6837,7 +7068,7 @@
             <w:r>
               <w:rPr>
                 <w:b/>
-                <w:sz w:val="16"/>
+                <w:sz w:val="15"/>
               </w:rPr>
               <w:t>0.97 (0.95–0.98)</w:t>
             </w:r>
@@ -6845,7 +7076,7 @@
         </w:tc>
         <w:tc>
           <w:tcPr>
-            <w:tcW w:type="dxa" w:w="1701"/>
+            <w:tcW w:type="dxa" w:w="1417"/>
           </w:tcPr>
           <w:p>
             <w:pPr>
@@ -6855,7 +7086,25 @@
             <w:r/>
             <w:r>
               <w:rPr>
-                <w:sz w:val="16"/>
+                <w:sz w:val="15"/>
+              </w:rPr>
+              <w:t>0.97 (0.95–0.99)</w:t>
+            </w:r>
+          </w:p>
+        </w:tc>
+        <w:tc>
+          <w:tcPr>
+            <w:tcW w:type="dxa" w:w="1417"/>
+          </w:tcPr>
+          <w:p>
+            <w:pPr>
+              <w:spacing w:after="0" w:line="240" w:lineRule="auto"/>
+              <w:jc w:val="center"/>
+            </w:pPr>
+            <w:r/>
+            <w:r>
+              <w:rPr>
+                <w:sz w:val="15"/>
               </w:rPr>
               <w:t>1.00 (0.98–1.02)</w:t>
             </w:r>
@@ -6863,7 +7112,7 @@
         </w:tc>
         <w:tc>
           <w:tcPr>
-            <w:tcW w:type="dxa" w:w="1701"/>
+            <w:tcW w:type="dxa" w:w="1417"/>
           </w:tcPr>
           <w:p>
             <w:pPr>
@@ -6873,7 +7122,7 @@
             <w:r/>
             <w:r>
               <w:rPr>
-                <w:sz w:val="16"/>
+                <w:sz w:val="15"/>
               </w:rPr>
               <w:t>1.00 (0.98–1.02)</w:t>
             </w:r>
@@ -6881,7 +7130,7 @@
         </w:tc>
         <w:tc>
           <w:tcPr>
-            <w:tcW w:type="dxa" w:w="1701"/>
+            <w:tcW w:type="dxa" w:w="1417"/>
           </w:tcPr>
           <w:p>
             <w:pPr>
@@ -6896,7 +7145,7 @@
             <w:r>
               <w:rPr>
                 <w:b/>
-                <w:sz w:val="16"/>
+                <w:sz w:val="15"/>
               </w:rPr>
               <w:t>0.95 (0.93–0.98)</w:t>
             </w:r>
@@ -6904,7 +7153,30 @@
         </w:tc>
         <w:tc>
           <w:tcPr>
-            <w:tcW w:type="dxa" w:w="1701"/>
+            <w:tcW w:type="dxa" w:w="1417"/>
+          </w:tcPr>
+          <w:p>
+            <w:pPr>
+              <w:spacing w:after="0" w:line="240" w:lineRule="auto"/>
+              <w:jc w:val="center"/>
+            </w:pPr>
+            <w:r>
+              <w:rPr>
+                <w:b/>
+              </w:rPr>
+            </w:r>
+            <w:r>
+              <w:rPr>
+                <w:b/>
+                <w:sz w:val="15"/>
+              </w:rPr>
+              <w:t>0.95 (0.93–0.97)</w:t>
+            </w:r>
+          </w:p>
+        </w:tc>
+        <w:tc>
+          <w:tcPr>
+            <w:tcW w:type="dxa" w:w="1417"/>
           </w:tcPr>
           <w:p>
             <w:pPr>
@@ -6914,7 +7186,7 @@
             <w:r/>
             <w:r>
               <w:rPr>
-                <w:sz w:val="16"/>
+                <w:sz w:val="15"/>
               </w:rPr>
               <w:t>1.00 (0.97–1.03)</w:t>
             </w:r>
@@ -6922,7 +7194,7 @@
         </w:tc>
         <w:tc>
           <w:tcPr>
-            <w:tcW w:type="dxa" w:w="1701"/>
+            <w:tcW w:type="dxa" w:w="1417"/>
           </w:tcPr>
           <w:p>
             <w:pPr>
@@ -6932,7 +7204,7 @@
             <w:r/>
             <w:r>
               <w:rPr>
-                <w:sz w:val="16"/>
+                <w:sz w:val="15"/>
               </w:rPr>
               <w:t>0.99 (0.97–1.02)</w:t>
             </w:r>
@@ -6942,7 +7214,7 @@
       <w:tr>
         <w:tc>
           <w:tcPr>
-            <w:tcW w:type="dxa" w:w="3969"/>
+            <w:tcW w:type="dxa" w:w="3402"/>
           </w:tcPr>
           <w:p>
             <w:pPr>
@@ -6952,7 +7224,7 @@
             <w:r/>
             <w:r>
               <w:rPr>
-                <w:sz w:val="16"/>
+                <w:sz w:val="15"/>
               </w:rPr>
               <w:t>Apolipoprotein B</w:t>
             </w:r>
@@ -6960,7 +7232,7 @@
         </w:tc>
         <w:tc>
           <w:tcPr>
-            <w:tcW w:type="dxa" w:w="1701"/>
+            <w:tcW w:type="dxa" w:w="1417"/>
           </w:tcPr>
           <w:p>
             <w:pPr>
@@ -6975,7 +7247,7 @@
             <w:r>
               <w:rPr>
                 <w:b/>
-                <w:sz w:val="16"/>
+                <w:sz w:val="15"/>
               </w:rPr>
               <w:t>0.97 (0.95–0.98)</w:t>
             </w:r>
@@ -6983,7 +7255,30 @@
         </w:tc>
         <w:tc>
           <w:tcPr>
-            <w:tcW w:type="dxa" w:w="1701"/>
+            <w:tcW w:type="dxa" w:w="1417"/>
+          </w:tcPr>
+          <w:p>
+            <w:pPr>
+              <w:spacing w:after="0" w:line="240" w:lineRule="auto"/>
+              <w:jc w:val="center"/>
+            </w:pPr>
+            <w:r>
+              <w:rPr>
+                <w:b/>
+              </w:rPr>
+            </w:r>
+            <w:r>
+              <w:rPr>
+                <w:b/>
+                <w:sz w:val="15"/>
+              </w:rPr>
+              <w:t>0.97 (0.95–0.98)</w:t>
+            </w:r>
+          </w:p>
+        </w:tc>
+        <w:tc>
+          <w:tcPr>
+            <w:tcW w:type="dxa" w:w="1417"/>
           </w:tcPr>
           <w:p>
             <w:pPr>
@@ -6993,7 +7288,7 @@
             <w:r/>
             <w:r>
               <w:rPr>
-                <w:sz w:val="16"/>
+                <w:sz w:val="15"/>
               </w:rPr>
               <w:t>1.00 (0.98–1.01)</w:t>
             </w:r>
@@ -7001,7 +7296,7 @@
         </w:tc>
         <w:tc>
           <w:tcPr>
-            <w:tcW w:type="dxa" w:w="1701"/>
+            <w:tcW w:type="dxa" w:w="1417"/>
           </w:tcPr>
           <w:p>
             <w:pPr>
@@ -7011,7 +7306,7 @@
             <w:r/>
             <w:r>
               <w:rPr>
-                <w:sz w:val="16"/>
+                <w:sz w:val="15"/>
               </w:rPr>
               <w:t>0.99 (0.98–1.01)</w:t>
             </w:r>
@@ -7019,7 +7314,7 @@
         </w:tc>
         <w:tc>
           <w:tcPr>
-            <w:tcW w:type="dxa" w:w="1701"/>
+            <w:tcW w:type="dxa" w:w="1417"/>
           </w:tcPr>
           <w:p>
             <w:pPr>
@@ -7029,7 +7324,7 @@
             <w:r/>
             <w:r>
               <w:rPr>
-                <w:sz w:val="16"/>
+                <w:sz w:val="15"/>
               </w:rPr>
               <w:t>0.98 (0.95–1.00)</w:t>
             </w:r>
@@ -7037,7 +7332,7 @@
         </w:tc>
         <w:tc>
           <w:tcPr>
-            <w:tcW w:type="dxa" w:w="1701"/>
+            <w:tcW w:type="dxa" w:w="1417"/>
           </w:tcPr>
           <w:p>
             <w:pPr>
@@ -7047,7 +7342,25 @@
             <w:r/>
             <w:r>
               <w:rPr>
-                <w:sz w:val="16"/>
+                <w:sz w:val="15"/>
+              </w:rPr>
+              <w:t>0.97 (0.95–1.00)</w:t>
+            </w:r>
+          </w:p>
+        </w:tc>
+        <w:tc>
+          <w:tcPr>
+            <w:tcW w:type="dxa" w:w="1417"/>
+          </w:tcPr>
+          <w:p>
+            <w:pPr>
+              <w:spacing w:after="0" w:line="240" w:lineRule="auto"/>
+              <w:jc w:val="center"/>
+            </w:pPr>
+            <w:r/>
+            <w:r>
+              <w:rPr>
+                <w:sz w:val="15"/>
               </w:rPr>
               <w:t>1.02 (1.00–1.05)</w:t>
             </w:r>
@@ -7055,7 +7368,7 @@
         </w:tc>
         <w:tc>
           <w:tcPr>
-            <w:tcW w:type="dxa" w:w="1701"/>
+            <w:tcW w:type="dxa" w:w="1417"/>
           </w:tcPr>
           <w:p>
             <w:pPr>
@@ -7065,7 +7378,7 @@
             <w:r/>
             <w:r>
               <w:rPr>
-                <w:sz w:val="16"/>
+                <w:sz w:val="15"/>
               </w:rPr>
               <w:t>1.01 (0.99–1.04)</w:t>
             </w:r>
@@ -7075,7 +7388,7 @@
       <w:tr>
         <w:tc>
           <w:tcPr>
-            <w:tcW w:type="dxa" w:w="3969"/>
+            <w:tcW w:type="dxa" w:w="3402"/>
           </w:tcPr>
           <w:p>
             <w:pPr>
@@ -7085,7 +7398,7 @@
             <w:r/>
             <w:r>
               <w:rPr>
-                <w:sz w:val="16"/>
+                <w:sz w:val="15"/>
               </w:rPr>
               <w:t>Total cholesterol</w:t>
             </w:r>
@@ -7093,7 +7406,7 @@
         </w:tc>
         <w:tc>
           <w:tcPr>
-            <w:tcW w:type="dxa" w:w="1701"/>
+            <w:tcW w:type="dxa" w:w="1417"/>
           </w:tcPr>
           <w:p>
             <w:pPr>
@@ -7108,7 +7421,7 @@
             <w:r>
               <w:rPr>
                 <w:b/>
-                <w:sz w:val="16"/>
+                <w:sz w:val="15"/>
               </w:rPr>
               <w:t>0.96 (0.95–0.98)</w:t>
             </w:r>
@@ -7116,7 +7429,7 @@
         </w:tc>
         <w:tc>
           <w:tcPr>
-            <w:tcW w:type="dxa" w:w="1701"/>
+            <w:tcW w:type="dxa" w:w="1417"/>
           </w:tcPr>
           <w:p>
             <w:pPr>
@@ -7126,7 +7439,25 @@
             <w:r/>
             <w:r>
               <w:rPr>
-                <w:sz w:val="16"/>
+                <w:sz w:val="15"/>
+              </w:rPr>
+              <w:t>0.97 (0.95–0.99)</w:t>
+            </w:r>
+          </w:p>
+        </w:tc>
+        <w:tc>
+          <w:tcPr>
+            <w:tcW w:type="dxa" w:w="1417"/>
+          </w:tcPr>
+          <w:p>
+            <w:pPr>
+              <w:spacing w:after="0" w:line="240" w:lineRule="auto"/>
+              <w:jc w:val="center"/>
+            </w:pPr>
+            <w:r/>
+            <w:r>
+              <w:rPr>
+                <w:sz w:val="15"/>
               </w:rPr>
               <w:t>1.00 (0.98–1.02)</w:t>
             </w:r>
@@ -7134,7 +7465,7 @@
         </w:tc>
         <w:tc>
           <w:tcPr>
-            <w:tcW w:type="dxa" w:w="1701"/>
+            <w:tcW w:type="dxa" w:w="1417"/>
           </w:tcPr>
           <w:p>
             <w:pPr>
@@ -7144,7 +7475,7 @@
             <w:r/>
             <w:r>
               <w:rPr>
-                <w:sz w:val="16"/>
+                <w:sz w:val="15"/>
               </w:rPr>
               <w:t>1.00 (0.98–1.02)</w:t>
             </w:r>
@@ -7152,7 +7483,7 @@
         </w:tc>
         <w:tc>
           <w:tcPr>
-            <w:tcW w:type="dxa" w:w="1701"/>
+            <w:tcW w:type="dxa" w:w="1417"/>
           </w:tcPr>
           <w:p>
             <w:pPr>
@@ -7167,7 +7498,7 @@
             <w:r>
               <w:rPr>
                 <w:b/>
-                <w:sz w:val="16"/>
+                <w:sz w:val="15"/>
               </w:rPr>
               <w:t>0.92 (0.90–0.94)</w:t>
             </w:r>
@@ -7175,7 +7506,30 @@
         </w:tc>
         <w:tc>
           <w:tcPr>
-            <w:tcW w:type="dxa" w:w="1701"/>
+            <w:tcW w:type="dxa" w:w="1417"/>
+          </w:tcPr>
+          <w:p>
+            <w:pPr>
+              <w:spacing w:after="0" w:line="240" w:lineRule="auto"/>
+              <w:jc w:val="center"/>
+            </w:pPr>
+            <w:r>
+              <w:rPr>
+                <w:b/>
+              </w:rPr>
+            </w:r>
+            <w:r>
+              <w:rPr>
+                <w:b/>
+                <w:sz w:val="15"/>
+              </w:rPr>
+              <w:t>0.92 (0.90–0.95)</w:t>
+            </w:r>
+          </w:p>
+        </w:tc>
+        <w:tc>
+          <w:tcPr>
+            <w:tcW w:type="dxa" w:w="1417"/>
           </w:tcPr>
           <w:p>
             <w:pPr>
@@ -7185,7 +7539,7 @@
             <w:r/>
             <w:r>
               <w:rPr>
-                <w:sz w:val="16"/>
+                <w:sz w:val="15"/>
               </w:rPr>
               <w:t>0.97 (0.94–1.00)</w:t>
             </w:r>
@@ -7193,7 +7547,7 @@
         </w:tc>
         <w:tc>
           <w:tcPr>
-            <w:tcW w:type="dxa" w:w="1701"/>
+            <w:tcW w:type="dxa" w:w="1417"/>
           </w:tcPr>
           <w:p>
             <w:pPr>
@@ -7203,7 +7557,7 @@
             <w:r/>
             <w:r>
               <w:rPr>
-                <w:sz w:val="16"/>
+                <w:sz w:val="15"/>
               </w:rPr>
               <w:t>0.97 (0.94–0.99)</w:t>
             </w:r>
@@ -7213,7 +7567,7 @@
       <w:tr>
         <w:tc>
           <w:tcPr>
-            <w:tcW w:type="dxa" w:w="3969"/>
+            <w:tcW w:type="dxa" w:w="3402"/>
           </w:tcPr>
           <w:p>
             <w:pPr>
@@ -7223,7 +7577,7 @@
             <w:r/>
             <w:r>
               <w:rPr>
-                <w:sz w:val="16"/>
+                <w:sz w:val="15"/>
               </w:rPr>
               <w:t>Triglycerides in very small VLDL, % of lipids</w:t>
             </w:r>
@@ -7231,7 +7585,7 @@
         </w:tc>
         <w:tc>
           <w:tcPr>
-            <w:tcW w:type="dxa" w:w="1701"/>
+            <w:tcW w:type="dxa" w:w="1417"/>
           </w:tcPr>
           <w:p>
             <w:pPr>
@@ -7246,7 +7600,7 @@
             <w:r>
               <w:rPr>
                 <w:b/>
-                <w:sz w:val="16"/>
+                <w:sz w:val="15"/>
               </w:rPr>
               <w:t>1.10 (1.08–1.12)</w:t>
             </w:r>
@@ -7254,7 +7608,7 @@
         </w:tc>
         <w:tc>
           <w:tcPr>
-            <w:tcW w:type="dxa" w:w="1701"/>
+            <w:tcW w:type="dxa" w:w="1417"/>
           </w:tcPr>
           <w:p>
             <w:pPr>
@@ -7269,7 +7623,30 @@
             <w:r>
               <w:rPr>
                 <w:b/>
-                <w:sz w:val="16"/>
+                <w:sz w:val="15"/>
+              </w:rPr>
+              <w:t>1.08 (1.06–1.10)</w:t>
+            </w:r>
+          </w:p>
+        </w:tc>
+        <w:tc>
+          <w:tcPr>
+            <w:tcW w:type="dxa" w:w="1417"/>
+          </w:tcPr>
+          <w:p>
+            <w:pPr>
+              <w:spacing w:after="0" w:line="240" w:lineRule="auto"/>
+              <w:jc w:val="center"/>
+            </w:pPr>
+            <w:r>
+              <w:rPr>
+                <w:b/>
+              </w:rPr>
+            </w:r>
+            <w:r>
+              <w:rPr>
+                <w:b/>
+                <w:sz w:val="15"/>
               </w:rPr>
               <w:t>1.07 (1.05–1.09)</w:t>
             </w:r>
@@ -7277,7 +7654,7 @@
         </w:tc>
         <w:tc>
           <w:tcPr>
-            <w:tcW w:type="dxa" w:w="1701"/>
+            <w:tcW w:type="dxa" w:w="1417"/>
           </w:tcPr>
           <w:p>
             <w:pPr>
@@ -7292,7 +7669,7 @@
             <w:r>
               <w:rPr>
                 <w:b/>
-                <w:sz w:val="16"/>
+                <w:sz w:val="15"/>
               </w:rPr>
               <w:t>1.05 (1.03–1.07)</w:t>
             </w:r>
@@ -7300,7 +7677,7 @@
         </w:tc>
         <w:tc>
           <w:tcPr>
-            <w:tcW w:type="dxa" w:w="1701"/>
+            <w:tcW w:type="dxa" w:w="1417"/>
           </w:tcPr>
           <w:p>
             <w:pPr>
@@ -7315,7 +7692,7 @@
             <w:r>
               <w:rPr>
                 <w:b/>
-                <w:sz w:val="16"/>
+                <w:sz w:val="15"/>
               </w:rPr>
               <w:t>1.14 (1.11–1.17)</w:t>
             </w:r>
@@ -7323,7 +7700,7 @@
         </w:tc>
         <w:tc>
           <w:tcPr>
-            <w:tcW w:type="dxa" w:w="1701"/>
+            <w:tcW w:type="dxa" w:w="1417"/>
           </w:tcPr>
           <w:p>
             <w:pPr>
@@ -7338,7 +7715,30 @@
             <w:r>
               <w:rPr>
                 <w:b/>
-                <w:sz w:val="16"/>
+                <w:sz w:val="15"/>
+              </w:rPr>
+              <w:t>1.10 (1.07–1.13)</w:t>
+            </w:r>
+          </w:p>
+        </w:tc>
+        <w:tc>
+          <w:tcPr>
+            <w:tcW w:type="dxa" w:w="1417"/>
+          </w:tcPr>
+          <w:p>
+            <w:pPr>
+              <w:spacing w:after="0" w:line="240" w:lineRule="auto"/>
+              <w:jc w:val="center"/>
+            </w:pPr>
+            <w:r>
+              <w:rPr>
+                <w:b/>
+              </w:rPr>
+            </w:r>
+            <w:r>
+              <w:rPr>
+                <w:b/>
+                <w:sz w:val="15"/>
               </w:rPr>
               <w:t>1.07 (1.05–1.10)</w:t>
             </w:r>
@@ -7346,7 +7746,7 @@
         </w:tc>
         <w:tc>
           <w:tcPr>
-            <w:tcW w:type="dxa" w:w="1701"/>
+            <w:tcW w:type="dxa" w:w="1417"/>
           </w:tcPr>
           <w:p>
             <w:pPr>
@@ -7356,7 +7756,7 @@
             <w:r/>
             <w:r>
               <w:rPr>
-                <w:sz w:val="16"/>
+                <w:sz w:val="15"/>
               </w:rPr>
               <w:t>1.05 (1.02–1.08)</w:t>
             </w:r>
@@ -7366,7 +7766,7 @@
       <w:tr>
         <w:tc>
           <w:tcPr>
-            <w:tcW w:type="dxa" w:w="3969"/>
+            <w:tcW w:type="dxa" w:w="3402"/>
           </w:tcPr>
           <w:p>
             <w:pPr>
@@ -7380,7 +7780,7 @@
             <w:r>
               <w:rPr>
                 <w:b/>
-                <w:sz w:val="16"/>
+                <w:sz w:val="15"/>
               </w:rPr>
               <w:t>Inflammation</w:t>
             </w:r>
@@ -7388,7 +7788,7 @@
         </w:tc>
         <w:tc>
           <w:tcPr>
-            <w:tcW w:type="dxa" w:w="1701"/>
+            <w:tcW w:type="dxa" w:w="1417"/>
           </w:tcPr>
           <w:p>
             <w:pPr>
@@ -7404,7 +7804,7 @@
         </w:tc>
         <w:tc>
           <w:tcPr>
-            <w:tcW w:type="dxa" w:w="1701"/>
+            <w:tcW w:type="dxa" w:w="1417"/>
           </w:tcPr>
           <w:p>
             <w:pPr>
@@ -7420,7 +7820,7 @@
         </w:tc>
         <w:tc>
           <w:tcPr>
-            <w:tcW w:type="dxa" w:w="1701"/>
+            <w:tcW w:type="dxa" w:w="1417"/>
           </w:tcPr>
           <w:p>
             <w:pPr>
@@ -7436,7 +7836,7 @@
         </w:tc>
         <w:tc>
           <w:tcPr>
-            <w:tcW w:type="dxa" w:w="1701"/>
+            <w:tcW w:type="dxa" w:w="1417"/>
           </w:tcPr>
           <w:p>
             <w:pPr>
@@ -7452,7 +7852,7 @@
         </w:tc>
         <w:tc>
           <w:tcPr>
-            <w:tcW w:type="dxa" w:w="1701"/>
+            <w:tcW w:type="dxa" w:w="1417"/>
           </w:tcPr>
           <w:p>
             <w:pPr>
@@ -7468,7 +7868,39 @@
         </w:tc>
         <w:tc>
           <w:tcPr>
-            <w:tcW w:type="dxa" w:w="1701"/>
+            <w:tcW w:type="dxa" w:w="1417"/>
+          </w:tcPr>
+          <w:p>
+            <w:pPr>
+              <w:spacing w:after="0" w:line="240" w:lineRule="auto"/>
+              <w:jc w:val="center"/>
+            </w:pPr>
+            <w:r>
+              <w:rPr>
+                <w:b/>
+              </w:rPr>
+            </w:r>
+          </w:p>
+        </w:tc>
+        <w:tc>
+          <w:tcPr>
+            <w:tcW w:type="dxa" w:w="1417"/>
+          </w:tcPr>
+          <w:p>
+            <w:pPr>
+              <w:spacing w:after="0" w:line="240" w:lineRule="auto"/>
+              <w:jc w:val="center"/>
+            </w:pPr>
+            <w:r>
+              <w:rPr>
+                <w:b/>
+              </w:rPr>
+            </w:r>
+          </w:p>
+        </w:tc>
+        <w:tc>
+          <w:tcPr>
+            <w:tcW w:type="dxa" w:w="1417"/>
           </w:tcPr>
           <w:p>
             <w:pPr>
@@ -7486,7 +7918,7 @@
       <w:tr>
         <w:tc>
           <w:tcPr>
-            <w:tcW w:type="dxa" w:w="3969"/>
+            <w:tcW w:type="dxa" w:w="3402"/>
           </w:tcPr>
           <w:p>
             <w:pPr>
@@ -7496,7 +7928,7 @@
             <w:r/>
             <w:r>
               <w:rPr>
-                <w:sz w:val="16"/>
+                <w:sz w:val="15"/>
               </w:rPr>
               <w:t>Glycoprotein acetyls</w:t>
             </w:r>
@@ -7504,7 +7936,7 @@
         </w:tc>
         <w:tc>
           <w:tcPr>
-            <w:tcW w:type="dxa" w:w="1701"/>
+            <w:tcW w:type="dxa" w:w="1417"/>
           </w:tcPr>
           <w:p>
             <w:pPr>
@@ -7519,7 +7951,7 @@
             <w:r>
               <w:rPr>
                 <w:b/>
-                <w:sz w:val="16"/>
+                <w:sz w:val="15"/>
               </w:rPr>
               <w:t>1.08 (1.06–1.10)</w:t>
             </w:r>
@@ -7527,7 +7959,7 @@
         </w:tc>
         <w:tc>
           <w:tcPr>
-            <w:tcW w:type="dxa" w:w="1701"/>
+            <w:tcW w:type="dxa" w:w="1417"/>
           </w:tcPr>
           <w:p>
             <w:pPr>
@@ -7542,7 +7974,30 @@
             <w:r>
               <w:rPr>
                 <w:b/>
-                <w:sz w:val="16"/>
+                <w:sz w:val="15"/>
+              </w:rPr>
+              <w:t>1.06 (1.03–1.08)</w:t>
+            </w:r>
+          </w:p>
+        </w:tc>
+        <w:tc>
+          <w:tcPr>
+            <w:tcW w:type="dxa" w:w="1417"/>
+          </w:tcPr>
+          <w:p>
+            <w:pPr>
+              <w:spacing w:after="0" w:line="240" w:lineRule="auto"/>
+              <w:jc w:val="center"/>
+            </w:pPr>
+            <w:r>
+              <w:rPr>
+                <w:b/>
+              </w:rPr>
+            </w:r>
+            <w:r>
+              <w:rPr>
+                <w:b/>
+                <w:sz w:val="15"/>
               </w:rPr>
               <w:t>1.07 (1.05–1.09)</w:t>
             </w:r>
@@ -7550,7 +8005,7 @@
         </w:tc>
         <w:tc>
           <w:tcPr>
-            <w:tcW w:type="dxa" w:w="1701"/>
+            <w:tcW w:type="dxa" w:w="1417"/>
           </w:tcPr>
           <w:p>
             <w:pPr>
@@ -7565,7 +8020,7 @@
             <w:r>
               <w:rPr>
                 <w:b/>
-                <w:sz w:val="16"/>
+                <w:sz w:val="15"/>
               </w:rPr>
               <w:t>1.05 (1.03–1.07)</w:t>
             </w:r>
@@ -7573,7 +8028,7 @@
         </w:tc>
         <w:tc>
           <w:tcPr>
-            <w:tcW w:type="dxa" w:w="1701"/>
+            <w:tcW w:type="dxa" w:w="1417"/>
           </w:tcPr>
           <w:p>
             <w:pPr>
@@ -7588,7 +8043,7 @@
             <w:r>
               <w:rPr>
                 <w:b/>
-                <w:sz w:val="16"/>
+                <w:sz w:val="15"/>
               </w:rPr>
               <w:t>1.18 (1.15–1.21)</w:t>
             </w:r>
@@ -7596,7 +8051,7 @@
         </w:tc>
         <w:tc>
           <w:tcPr>
-            <w:tcW w:type="dxa" w:w="1701"/>
+            <w:tcW w:type="dxa" w:w="1417"/>
           </w:tcPr>
           <w:p>
             <w:pPr>
@@ -7611,7 +8066,30 @@
             <w:r>
               <w:rPr>
                 <w:b/>
-                <w:sz w:val="16"/>
+                <w:sz w:val="15"/>
+              </w:rPr>
+              <w:t>1.12 (1.09–1.16)</w:t>
+            </w:r>
+          </w:p>
+        </w:tc>
+        <w:tc>
+          <w:tcPr>
+            <w:tcW w:type="dxa" w:w="1417"/>
+          </w:tcPr>
+          <w:p>
+            <w:pPr>
+              <w:spacing w:after="0" w:line="240" w:lineRule="auto"/>
+              <w:jc w:val="center"/>
+            </w:pPr>
+            <w:r>
+              <w:rPr>
+                <w:b/>
+              </w:rPr>
+            </w:r>
+            <w:r>
+              <w:rPr>
+                <w:b/>
+                <w:sz w:val="15"/>
               </w:rPr>
               <w:t>1.14 (1.11–1.17)</w:t>
             </w:r>
@@ -7619,7 +8097,7 @@
         </w:tc>
         <w:tc>
           <w:tcPr>
-            <w:tcW w:type="dxa" w:w="1701"/>
+            <w:tcW w:type="dxa" w:w="1417"/>
           </w:tcPr>
           <w:p>
             <w:pPr>
@@ -7634,7 +8112,7 @@
             <w:r>
               <w:rPr>
                 <w:b/>
-                <w:sz w:val="16"/>
+                <w:sz w:val="15"/>
               </w:rPr>
               <w:t>1.10 (1.07–1.14)</w:t>
             </w:r>
@@ -7644,7 +8122,7 @@
       <w:tr>
         <w:tc>
           <w:tcPr>
-            <w:tcW w:type="dxa" w:w="3969"/>
+            <w:tcW w:type="dxa" w:w="3402"/>
           </w:tcPr>
           <w:p>
             <w:pPr>
@@ -7654,7 +8132,7 @@
             <w:r/>
             <w:r>
               <w:rPr>
-                <w:sz w:val="16"/>
+                <w:sz w:val="15"/>
               </w:rPr>
               <w:t>Albumin</w:t>
             </w:r>
@@ -7662,7 +8140,7 @@
         </w:tc>
         <w:tc>
           <w:tcPr>
-            <w:tcW w:type="dxa" w:w="1701"/>
+            <w:tcW w:type="dxa" w:w="1417"/>
           </w:tcPr>
           <w:p>
             <w:pPr>
@@ -7677,7 +8155,7 @@
             <w:r>
               <w:rPr>
                 <w:b/>
-                <w:sz w:val="16"/>
+                <w:sz w:val="15"/>
               </w:rPr>
               <w:t>0.97 (0.95–0.98)</w:t>
             </w:r>
@@ -7685,7 +8163,7 @@
         </w:tc>
         <w:tc>
           <w:tcPr>
-            <w:tcW w:type="dxa" w:w="1701"/>
+            <w:tcW w:type="dxa" w:w="1417"/>
           </w:tcPr>
           <w:p>
             <w:pPr>
@@ -7695,7 +8173,7 @@
             <w:r/>
             <w:r>
               <w:rPr>
-                <w:sz w:val="16"/>
+                <w:sz w:val="15"/>
               </w:rPr>
               <w:t>0.98 (0.96–0.99)</w:t>
             </w:r>
@@ -7703,7 +8181,7 @@
         </w:tc>
         <w:tc>
           <w:tcPr>
-            <w:tcW w:type="dxa" w:w="1701"/>
+            <w:tcW w:type="dxa" w:w="1417"/>
           </w:tcPr>
           <w:p>
             <w:pPr>
@@ -7713,7 +8191,25 @@
             <w:r/>
             <w:r>
               <w:rPr>
-                <w:sz w:val="16"/>
+                <w:sz w:val="15"/>
+              </w:rPr>
+              <w:t>0.98 (0.96–0.99)</w:t>
+            </w:r>
+          </w:p>
+        </w:tc>
+        <w:tc>
+          <w:tcPr>
+            <w:tcW w:type="dxa" w:w="1417"/>
+          </w:tcPr>
+          <w:p>
+            <w:pPr>
+              <w:spacing w:after="0" w:line="240" w:lineRule="auto"/>
+              <w:jc w:val="center"/>
+            </w:pPr>
+            <w:r/>
+            <w:r>
+              <w:rPr>
+                <w:sz w:val="15"/>
               </w:rPr>
               <w:t>0.98 (0.97–1.00)</w:t>
             </w:r>
@@ -7721,7 +8217,7 @@
         </w:tc>
         <w:tc>
           <w:tcPr>
-            <w:tcW w:type="dxa" w:w="1701"/>
+            <w:tcW w:type="dxa" w:w="1417"/>
           </w:tcPr>
           <w:p>
             <w:pPr>
@@ -7736,7 +8232,7 @@
             <w:r>
               <w:rPr>
                 <w:b/>
-                <w:sz w:val="16"/>
+                <w:sz w:val="15"/>
               </w:rPr>
               <w:t>0.94 (0.91–0.96)</w:t>
             </w:r>
@@ -7744,7 +8240,7 @@
         </w:tc>
         <w:tc>
           <w:tcPr>
-            <w:tcW w:type="dxa" w:w="1701"/>
+            <w:tcW w:type="dxa" w:w="1417"/>
           </w:tcPr>
           <w:p>
             <w:pPr>
@@ -7754,7 +8250,7 @@
             <w:r/>
             <w:r>
               <w:rPr>
-                <w:sz w:val="16"/>
+                <w:sz w:val="15"/>
               </w:rPr>
               <w:t>0.95 (0.93–0.98)</w:t>
             </w:r>
@@ -7762,7 +8258,7 @@
         </w:tc>
         <w:tc>
           <w:tcPr>
-            <w:tcW w:type="dxa" w:w="1701"/>
+            <w:tcW w:type="dxa" w:w="1417"/>
           </w:tcPr>
           <w:p>
             <w:pPr>
@@ -7772,7 +8268,25 @@
             <w:r/>
             <w:r>
               <w:rPr>
-                <w:sz w:val="16"/>
+                <w:sz w:val="15"/>
+              </w:rPr>
+              <w:t>0.95 (0.93–0.98)</w:t>
+            </w:r>
+          </w:p>
+        </w:tc>
+        <w:tc>
+          <w:tcPr>
+            <w:tcW w:type="dxa" w:w="1417"/>
+          </w:tcPr>
+          <w:p>
+            <w:pPr>
+              <w:spacing w:after="0" w:line="240" w:lineRule="auto"/>
+              <w:jc w:val="center"/>
+            </w:pPr>
+            <w:r/>
+            <w:r>
+              <w:rPr>
+                <w:sz w:val="15"/>
               </w:rPr>
               <w:t>0.96 (0.94–0.99)</w:t>
             </w:r>
@@ -7782,7 +8296,7 @@
       <w:tr>
         <w:tc>
           <w:tcPr>
-            <w:tcW w:type="dxa" w:w="3969"/>
+            <w:tcW w:type="dxa" w:w="3402"/>
           </w:tcPr>
           <w:p>
             <w:pPr>
@@ -7796,7 +8310,7 @@
             <w:r>
               <w:rPr>
                 <w:b/>
-                <w:sz w:val="16"/>
+                <w:sz w:val="15"/>
               </w:rPr>
               <w:t>Fatty acids, % of total fatty acids</w:t>
             </w:r>
@@ -7804,7 +8318,7 @@
         </w:tc>
         <w:tc>
           <w:tcPr>
-            <w:tcW w:type="dxa" w:w="1701"/>
+            <w:tcW w:type="dxa" w:w="1417"/>
           </w:tcPr>
           <w:p>
             <w:pPr>
@@ -7820,7 +8334,7 @@
         </w:tc>
         <w:tc>
           <w:tcPr>
-            <w:tcW w:type="dxa" w:w="1701"/>
+            <w:tcW w:type="dxa" w:w="1417"/>
           </w:tcPr>
           <w:p>
             <w:pPr>
@@ -7836,7 +8350,7 @@
         </w:tc>
         <w:tc>
           <w:tcPr>
-            <w:tcW w:type="dxa" w:w="1701"/>
+            <w:tcW w:type="dxa" w:w="1417"/>
           </w:tcPr>
           <w:p>
             <w:pPr>
@@ -7852,7 +8366,7 @@
         </w:tc>
         <w:tc>
           <w:tcPr>
-            <w:tcW w:type="dxa" w:w="1701"/>
+            <w:tcW w:type="dxa" w:w="1417"/>
           </w:tcPr>
           <w:p>
             <w:pPr>
@@ -7868,7 +8382,7 @@
         </w:tc>
         <w:tc>
           <w:tcPr>
-            <w:tcW w:type="dxa" w:w="1701"/>
+            <w:tcW w:type="dxa" w:w="1417"/>
           </w:tcPr>
           <w:p>
             <w:pPr>
@@ -7884,7 +8398,39 @@
         </w:tc>
         <w:tc>
           <w:tcPr>
-            <w:tcW w:type="dxa" w:w="1701"/>
+            <w:tcW w:type="dxa" w:w="1417"/>
+          </w:tcPr>
+          <w:p>
+            <w:pPr>
+              <w:spacing w:after="0" w:line="240" w:lineRule="auto"/>
+              <w:jc w:val="center"/>
+            </w:pPr>
+            <w:r>
+              <w:rPr>
+                <w:b/>
+              </w:rPr>
+            </w:r>
+          </w:p>
+        </w:tc>
+        <w:tc>
+          <w:tcPr>
+            <w:tcW w:type="dxa" w:w="1417"/>
+          </w:tcPr>
+          <w:p>
+            <w:pPr>
+              <w:spacing w:after="0" w:line="240" w:lineRule="auto"/>
+              <w:jc w:val="center"/>
+            </w:pPr>
+            <w:r>
+              <w:rPr>
+                <w:b/>
+              </w:rPr>
+            </w:r>
+          </w:p>
+        </w:tc>
+        <w:tc>
+          <w:tcPr>
+            <w:tcW w:type="dxa" w:w="1417"/>
           </w:tcPr>
           <w:p>
             <w:pPr>
@@ -7902,7 +8448,7 @@
       <w:tr>
         <w:tc>
           <w:tcPr>
-            <w:tcW w:type="dxa" w:w="3969"/>
+            <w:tcW w:type="dxa" w:w="3402"/>
           </w:tcPr>
           <w:p>
             <w:pPr>
@@ -7912,7 +8458,7 @@
             <w:r/>
             <w:r>
               <w:rPr>
-                <w:sz w:val="16"/>
+                <w:sz w:val="15"/>
               </w:rPr>
               <w:t>Linoleic acid</w:t>
             </w:r>
@@ -7920,7 +8466,7 @@
         </w:tc>
         <w:tc>
           <w:tcPr>
-            <w:tcW w:type="dxa" w:w="1701"/>
+            <w:tcW w:type="dxa" w:w="1417"/>
           </w:tcPr>
           <w:p>
             <w:pPr>
@@ -7935,7 +8481,7 @@
             <w:r>
               <w:rPr>
                 <w:b/>
-                <w:sz w:val="16"/>
+                <w:sz w:val="15"/>
               </w:rPr>
               <w:t>0.89 (0.88–0.91)</w:t>
             </w:r>
@@ -7943,7 +8489,7 @@
         </w:tc>
         <w:tc>
           <w:tcPr>
-            <w:tcW w:type="dxa" w:w="1701"/>
+            <w:tcW w:type="dxa" w:w="1417"/>
           </w:tcPr>
           <w:p>
             <w:pPr>
@@ -7958,7 +8504,30 @@
             <w:r>
               <w:rPr>
                 <w:b/>
-                <w:sz w:val="16"/>
+                <w:sz w:val="15"/>
+              </w:rPr>
+              <w:t>0.91 (0.89–0.93)</w:t>
+            </w:r>
+          </w:p>
+        </w:tc>
+        <w:tc>
+          <w:tcPr>
+            <w:tcW w:type="dxa" w:w="1417"/>
+          </w:tcPr>
+          <w:p>
+            <w:pPr>
+              <w:spacing w:after="0" w:line="240" w:lineRule="auto"/>
+              <w:jc w:val="center"/>
+            </w:pPr>
+            <w:r>
+              <w:rPr>
+                <w:b/>
+              </w:rPr>
+            </w:r>
+            <w:r>
+              <w:rPr>
+                <w:b/>
+                <w:sz w:val="15"/>
               </w:rPr>
               <w:t>0.92 (0.90–0.94)</w:t>
             </w:r>
@@ -7966,7 +8535,7 @@
         </w:tc>
         <w:tc>
           <w:tcPr>
-            <w:tcW w:type="dxa" w:w="1701"/>
+            <w:tcW w:type="dxa" w:w="1417"/>
           </w:tcPr>
           <w:p>
             <w:pPr>
@@ -7981,7 +8550,7 @@
             <w:r>
               <w:rPr>
                 <w:b/>
-                <w:sz w:val="16"/>
+                <w:sz w:val="15"/>
               </w:rPr>
               <w:t>0.93 (0.91–0.95)</w:t>
             </w:r>
@@ -7989,7 +8558,7 @@
         </w:tc>
         <w:tc>
           <w:tcPr>
-            <w:tcW w:type="dxa" w:w="1701"/>
+            <w:tcW w:type="dxa" w:w="1417"/>
           </w:tcPr>
           <w:p>
             <w:pPr>
@@ -8004,7 +8573,7 @@
             <w:r>
               <w:rPr>
                 <w:b/>
-                <w:sz w:val="16"/>
+                <w:sz w:val="15"/>
               </w:rPr>
               <w:t>0.89 (0.87–0.92)</w:t>
             </w:r>
@@ -8012,7 +8581,7 @@
         </w:tc>
         <w:tc>
           <w:tcPr>
-            <w:tcW w:type="dxa" w:w="1701"/>
+            <w:tcW w:type="dxa" w:w="1417"/>
           </w:tcPr>
           <w:p>
             <w:pPr>
@@ -8027,7 +8596,30 @@
             <w:r>
               <w:rPr>
                 <w:b/>
-                <w:sz w:val="16"/>
+                <w:sz w:val="15"/>
+              </w:rPr>
+              <w:t>0.92 (0.90–0.95)</w:t>
+            </w:r>
+          </w:p>
+        </w:tc>
+        <w:tc>
+          <w:tcPr>
+            <w:tcW w:type="dxa" w:w="1417"/>
+          </w:tcPr>
+          <w:p>
+            <w:pPr>
+              <w:spacing w:after="0" w:line="240" w:lineRule="auto"/>
+              <w:jc w:val="center"/>
+            </w:pPr>
+            <w:r>
+              <w:rPr>
+                <w:b/>
+              </w:rPr>
+            </w:r>
+            <w:r>
+              <w:rPr>
+                <w:b/>
+                <w:sz w:val="15"/>
               </w:rPr>
               <w:t>0.94 (0.91–0.96)</w:t>
             </w:r>
@@ -8035,7 +8627,7 @@
         </w:tc>
         <w:tc>
           <w:tcPr>
-            <w:tcW w:type="dxa" w:w="1701"/>
+            <w:tcW w:type="dxa" w:w="1417"/>
           </w:tcPr>
           <w:p>
             <w:pPr>
@@ -8045,7 +8637,7 @@
             <w:r/>
             <w:r>
               <w:rPr>
-                <w:sz w:val="16"/>
+                <w:sz w:val="15"/>
               </w:rPr>
               <w:t>0.96 (0.93–0.98)</w:t>
             </w:r>
@@ -8055,7 +8647,7 @@
       <w:tr>
         <w:tc>
           <w:tcPr>
-            <w:tcW w:type="dxa" w:w="3969"/>
+            <w:tcW w:type="dxa" w:w="3402"/>
           </w:tcPr>
           <w:p>
             <w:pPr>
@@ -8065,7 +8657,7 @@
             <w:r/>
             <w:r>
               <w:rPr>
-                <w:sz w:val="16"/>
+                <w:sz w:val="15"/>
               </w:rPr>
               <w:t>Omega-6 fatty acids</w:t>
             </w:r>
@@ -8073,7 +8665,7 @@
         </w:tc>
         <w:tc>
           <w:tcPr>
-            <w:tcW w:type="dxa" w:w="1701"/>
+            <w:tcW w:type="dxa" w:w="1417"/>
           </w:tcPr>
           <w:p>
             <w:pPr>
@@ -8088,7 +8680,7 @@
             <w:r>
               <w:rPr>
                 <w:b/>
-                <w:sz w:val="16"/>
+                <w:sz w:val="15"/>
               </w:rPr>
               <w:t>0.91 (0.89–0.93)</w:t>
             </w:r>
@@ -8096,7 +8688,7 @@
         </w:tc>
         <w:tc>
           <w:tcPr>
-            <w:tcW w:type="dxa" w:w="1701"/>
+            <w:tcW w:type="dxa" w:w="1417"/>
           </w:tcPr>
           <w:p>
             <w:pPr>
@@ -8111,7 +8703,30 @@
             <w:r>
               <w:rPr>
                 <w:b/>
-                <w:sz w:val="16"/>
+                <w:sz w:val="15"/>
+              </w:rPr>
+              <w:t>0.93 (0.91–0.95)</w:t>
+            </w:r>
+          </w:p>
+        </w:tc>
+        <w:tc>
+          <w:tcPr>
+            <w:tcW w:type="dxa" w:w="1417"/>
+          </w:tcPr>
+          <w:p>
+            <w:pPr>
+              <w:spacing w:after="0" w:line="240" w:lineRule="auto"/>
+              <w:jc w:val="center"/>
+            </w:pPr>
+            <w:r>
+              <w:rPr>
+                <w:b/>
+              </w:rPr>
+            </w:r>
+            <w:r>
+              <w:rPr>
+                <w:b/>
+                <w:sz w:val="15"/>
               </w:rPr>
               <w:t>0.92 (0.91–0.94)</w:t>
             </w:r>
@@ -8119,7 +8734,7 @@
         </w:tc>
         <w:tc>
           <w:tcPr>
-            <w:tcW w:type="dxa" w:w="1701"/>
+            <w:tcW w:type="dxa" w:w="1417"/>
           </w:tcPr>
           <w:p>
             <w:pPr>
@@ -8134,7 +8749,7 @@
             <w:r>
               <w:rPr>
                 <w:b/>
-                <w:sz w:val="16"/>
+                <w:sz w:val="15"/>
               </w:rPr>
               <w:t>0.94 (0.92–0.96)</w:t>
             </w:r>
@@ -8142,7 +8757,7 @@
         </w:tc>
         <w:tc>
           <w:tcPr>
-            <w:tcW w:type="dxa" w:w="1701"/>
+            <w:tcW w:type="dxa" w:w="1417"/>
           </w:tcPr>
           <w:p>
             <w:pPr>
@@ -8157,7 +8772,7 @@
             <w:r>
               <w:rPr>
                 <w:b/>
-                <w:sz w:val="16"/>
+                <w:sz w:val="15"/>
               </w:rPr>
               <w:t>0.90 (0.87–0.92)</w:t>
             </w:r>
@@ -8165,7 +8780,7 @@
         </w:tc>
         <w:tc>
           <w:tcPr>
-            <w:tcW w:type="dxa" w:w="1701"/>
+            <w:tcW w:type="dxa" w:w="1417"/>
           </w:tcPr>
           <w:p>
             <w:pPr>
@@ -8180,7 +8795,7 @@
             <w:r>
               <w:rPr>
                 <w:b/>
-                <w:sz w:val="16"/>
+                <w:sz w:val="15"/>
               </w:rPr>
               <w:t>0.93 (0.90–0.95)</w:t>
             </w:r>
@@ -8188,7 +8803,30 @@
         </w:tc>
         <w:tc>
           <w:tcPr>
-            <w:tcW w:type="dxa" w:w="1701"/>
+            <w:tcW w:type="dxa" w:w="1417"/>
+          </w:tcPr>
+          <w:p>
+            <w:pPr>
+              <w:spacing w:after="0" w:line="240" w:lineRule="auto"/>
+              <w:jc w:val="center"/>
+            </w:pPr>
+            <w:r>
+              <w:rPr>
+                <w:b/>
+              </w:rPr>
+            </w:r>
+            <w:r>
+              <w:rPr>
+                <w:b/>
+                <w:sz w:val="15"/>
+              </w:rPr>
+              <w:t>0.93 (0.90–0.95)</w:t>
+            </w:r>
+          </w:p>
+        </w:tc>
+        <w:tc>
+          <w:tcPr>
+            <w:tcW w:type="dxa" w:w="1417"/>
           </w:tcPr>
           <w:p>
             <w:pPr>
@@ -8198,7 +8836,7 @@
             <w:r/>
             <w:r>
               <w:rPr>
-                <w:sz w:val="16"/>
+                <w:sz w:val="15"/>
               </w:rPr>
               <w:t>0.95 (0.92–0.98)</w:t>
             </w:r>
@@ -8208,7 +8846,7 @@
       <w:tr>
         <w:tc>
           <w:tcPr>
-            <w:tcW w:type="dxa" w:w="3969"/>
+            <w:tcW w:type="dxa" w:w="3402"/>
           </w:tcPr>
           <w:p>
             <w:pPr>
@@ -8218,7 +8856,7 @@
             <w:r/>
             <w:r>
               <w:rPr>
-                <w:sz w:val="16"/>
+                <w:sz w:val="15"/>
               </w:rPr>
               <w:t>Monounsaturated fatty acids</w:t>
             </w:r>
@@ -8226,7 +8864,7 @@
         </w:tc>
         <w:tc>
           <w:tcPr>
-            <w:tcW w:type="dxa" w:w="1701"/>
+            <w:tcW w:type="dxa" w:w="1417"/>
           </w:tcPr>
           <w:p>
             <w:pPr>
@@ -8241,7 +8879,7 @@
             <w:r>
               <w:rPr>
                 <w:b/>
-                <w:sz w:val="16"/>
+                <w:sz w:val="15"/>
               </w:rPr>
               <w:t>1.09 (1.07–1.11)</w:t>
             </w:r>
@@ -8249,7 +8887,7 @@
         </w:tc>
         <w:tc>
           <w:tcPr>
-            <w:tcW w:type="dxa" w:w="1701"/>
+            <w:tcW w:type="dxa" w:w="1417"/>
           </w:tcPr>
           <w:p>
             <w:pPr>
@@ -8264,7 +8902,30 @@
             <w:r>
               <w:rPr>
                 <w:b/>
-                <w:sz w:val="16"/>
+                <w:sz w:val="15"/>
+              </w:rPr>
+              <w:t>1.06 (1.04–1.08)</w:t>
+            </w:r>
+          </w:p>
+        </w:tc>
+        <w:tc>
+          <w:tcPr>
+            <w:tcW w:type="dxa" w:w="1417"/>
+          </w:tcPr>
+          <w:p>
+            <w:pPr>
+              <w:spacing w:after="0" w:line="240" w:lineRule="auto"/>
+              <w:jc w:val="center"/>
+            </w:pPr>
+            <w:r>
+              <w:rPr>
+                <w:b/>
+              </w:rPr>
+            </w:r>
+            <w:r>
+              <w:rPr>
+                <w:b/>
+                <w:sz w:val="15"/>
               </w:rPr>
               <w:t>1.07 (1.05–1.09)</w:t>
             </w:r>
@@ -8272,7 +8933,7 @@
         </w:tc>
         <w:tc>
           <w:tcPr>
-            <w:tcW w:type="dxa" w:w="1701"/>
+            <w:tcW w:type="dxa" w:w="1417"/>
           </w:tcPr>
           <w:p>
             <w:pPr>
@@ -8287,7 +8948,7 @@
             <w:r>
               <w:rPr>
                 <w:b/>
-                <w:sz w:val="16"/>
+                <w:sz w:val="15"/>
               </w:rPr>
               <w:t>1.05 (1.03–1.07)</w:t>
             </w:r>
@@ -8295,7 +8956,7 @@
         </w:tc>
         <w:tc>
           <w:tcPr>
-            <w:tcW w:type="dxa" w:w="1701"/>
+            <w:tcW w:type="dxa" w:w="1417"/>
           </w:tcPr>
           <w:p>
             <w:pPr>
@@ -8310,7 +8971,7 @@
             <w:r>
               <w:rPr>
                 <w:b/>
-                <w:sz w:val="16"/>
+                <w:sz w:val="15"/>
               </w:rPr>
               <w:t>1.16 (1.13–1.19)</w:t>
             </w:r>
@@ -8318,7 +8979,7 @@
         </w:tc>
         <w:tc>
           <w:tcPr>
-            <w:tcW w:type="dxa" w:w="1701"/>
+            <w:tcW w:type="dxa" w:w="1417"/>
           </w:tcPr>
           <w:p>
             <w:pPr>
@@ -8333,7 +8994,30 @@
             <w:r>
               <w:rPr>
                 <w:b/>
-                <w:sz w:val="16"/>
+                <w:sz w:val="15"/>
+              </w:rPr>
+              <w:t>1.11 (1.08–1.15)</w:t>
+            </w:r>
+          </w:p>
+        </w:tc>
+        <w:tc>
+          <w:tcPr>
+            <w:tcW w:type="dxa" w:w="1417"/>
+          </w:tcPr>
+          <w:p>
+            <w:pPr>
+              <w:spacing w:after="0" w:line="240" w:lineRule="auto"/>
+              <w:jc w:val="center"/>
+            </w:pPr>
+            <w:r>
+              <w:rPr>
+                <w:b/>
+              </w:rPr>
+            </w:r>
+            <w:r>
+              <w:rPr>
+                <w:b/>
+                <w:sz w:val="15"/>
               </w:rPr>
               <w:t>1.11 (1.08–1.14)</w:t>
             </w:r>
@@ -8341,7 +9025,7 @@
         </w:tc>
         <w:tc>
           <w:tcPr>
-            <w:tcW w:type="dxa" w:w="1701"/>
+            <w:tcW w:type="dxa" w:w="1417"/>
           </w:tcPr>
           <w:p>
             <w:pPr>
@@ -8356,7 +9040,7 @@
             <w:r>
               <w:rPr>
                 <w:b/>
-                <w:sz w:val="16"/>
+                <w:sz w:val="15"/>
               </w:rPr>
               <w:t>1.08 (1.05–1.11)</w:t>
             </w:r>
@@ -8366,7 +9050,7 @@
       <w:tr>
         <w:tc>
           <w:tcPr>
-            <w:tcW w:type="dxa" w:w="3969"/>
+            <w:tcW w:type="dxa" w:w="3402"/>
             <w:tcBorders>
               <w:bottom w:val="single" w:sz="12" w:space="0" w:color="000000"/>
             </w:tcBorders>
@@ -8379,7 +9063,7 @@
             <w:r/>
             <w:r>
               <w:rPr>
-                <w:sz w:val="16"/>
+                <w:sz w:val="15"/>
               </w:rPr>
               <w:t>Saturated fatty acids</w:t>
             </w:r>
@@ -8387,7 +9071,7 @@
         </w:tc>
         <w:tc>
           <w:tcPr>
-            <w:tcW w:type="dxa" w:w="1701"/>
+            <w:tcW w:type="dxa" w:w="1417"/>
             <w:tcBorders>
               <w:bottom w:val="single" w:sz="12" w:space="0" w:color="000000"/>
             </w:tcBorders>
@@ -8405,7 +9089,7 @@
             <w:r>
               <w:rPr>
                 <w:b/>
-                <w:sz w:val="16"/>
+                <w:sz w:val="15"/>
               </w:rPr>
               <w:t>1.06 (1.04–1.08)</w:t>
             </w:r>
@@ -8413,7 +9097,7 @@
         </w:tc>
         <w:tc>
           <w:tcPr>
-            <w:tcW w:type="dxa" w:w="1701"/>
+            <w:tcW w:type="dxa" w:w="1417"/>
             <w:tcBorders>
               <w:bottom w:val="single" w:sz="12" w:space="0" w:color="000000"/>
             </w:tcBorders>
@@ -8431,15 +9115,15 @@
             <w:r>
               <w:rPr>
                 <w:b/>
-                <w:sz w:val="16"/>
-              </w:rPr>
-              <w:t>1.06 (1.04–1.08)</w:t>
-            </w:r>
-          </w:p>
-        </w:tc>
-        <w:tc>
-          <w:tcPr>
-            <w:tcW w:type="dxa" w:w="1701"/>
+                <w:sz w:val="15"/>
+              </w:rPr>
+              <w:t>1.05 (1.03–1.07)</w:t>
+            </w:r>
+          </w:p>
+        </w:tc>
+        <w:tc>
+          <w:tcPr>
+            <w:tcW w:type="dxa" w:w="1417"/>
             <w:tcBorders>
               <w:bottom w:val="single" w:sz="12" w:space="0" w:color="000000"/>
             </w:tcBorders>
@@ -8457,15 +9141,15 @@
             <w:r>
               <w:rPr>
                 <w:b/>
-                <w:sz w:val="16"/>
-              </w:rPr>
-              <w:t>1.05 (1.03–1.07)</w:t>
-            </w:r>
-          </w:p>
-        </w:tc>
-        <w:tc>
-          <w:tcPr>
-            <w:tcW w:type="dxa" w:w="1701"/>
+                <w:sz w:val="15"/>
+              </w:rPr>
+              <w:t>1.06 (1.04–1.08)</w:t>
+            </w:r>
+          </w:p>
+        </w:tc>
+        <w:tc>
+          <w:tcPr>
+            <w:tcW w:type="dxa" w:w="1417"/>
             <w:tcBorders>
               <w:bottom w:val="single" w:sz="12" w:space="0" w:color="000000"/>
             </w:tcBorders>
@@ -8475,18 +9159,23 @@
               <w:spacing w:after="0" w:line="240" w:lineRule="auto"/>
               <w:jc w:val="center"/>
             </w:pPr>
-            <w:r/>
-            <w:r>
-              <w:rPr>
-                <w:sz w:val="16"/>
-              </w:rPr>
-              <w:t>1.03 (1.00–1.05)</w:t>
-            </w:r>
-          </w:p>
-        </w:tc>
-        <w:tc>
-          <w:tcPr>
-            <w:tcW w:type="dxa" w:w="1701"/>
+            <w:r>
+              <w:rPr>
+                <w:b/>
+              </w:rPr>
+            </w:r>
+            <w:r>
+              <w:rPr>
+                <w:b/>
+                <w:sz w:val="15"/>
+              </w:rPr>
+              <w:t>1.05 (1.03–1.07)</w:t>
+            </w:r>
+          </w:p>
+        </w:tc>
+        <w:tc>
+          <w:tcPr>
+            <w:tcW w:type="dxa" w:w="1417"/>
             <w:tcBorders>
               <w:bottom w:val="single" w:sz="12" w:space="0" w:color="000000"/>
             </w:tcBorders>
@@ -8499,15 +9188,15 @@
             <w:r/>
             <w:r>
               <w:rPr>
-                <w:sz w:val="16"/>
-              </w:rPr>
-              <w:t>1.01 (0.99–1.04)</w:t>
-            </w:r>
-          </w:p>
-        </w:tc>
-        <w:tc>
-          <w:tcPr>
-            <w:tcW w:type="dxa" w:w="1701"/>
+                <w:sz w:val="15"/>
+              </w:rPr>
+              <w:t>1.03 (1.00–1.05)</w:t>
+            </w:r>
+          </w:p>
+        </w:tc>
+        <w:tc>
+          <w:tcPr>
+            <w:tcW w:type="dxa" w:w="1417"/>
             <w:tcBorders>
               <w:bottom w:val="single" w:sz="12" w:space="0" w:color="000000"/>
             </w:tcBorders>
@@ -8520,7 +9209,49 @@
             <w:r/>
             <w:r>
               <w:rPr>
-                <w:sz w:val="16"/>
+                <w:sz w:val="15"/>
+              </w:rPr>
+              <w:t>1.02 (0.99–1.04)</w:t>
+            </w:r>
+          </w:p>
+        </w:tc>
+        <w:tc>
+          <w:tcPr>
+            <w:tcW w:type="dxa" w:w="1417"/>
+            <w:tcBorders>
+              <w:bottom w:val="single" w:sz="12" w:space="0" w:color="000000"/>
+            </w:tcBorders>
+          </w:tcPr>
+          <w:p>
+            <w:pPr>
+              <w:spacing w:after="0" w:line="240" w:lineRule="auto"/>
+              <w:jc w:val="center"/>
+            </w:pPr>
+            <w:r/>
+            <w:r>
+              <w:rPr>
+                <w:sz w:val="15"/>
+              </w:rPr>
+              <w:t>1.01 (0.99–1.04)</w:t>
+            </w:r>
+          </w:p>
+        </w:tc>
+        <w:tc>
+          <w:tcPr>
+            <w:tcW w:type="dxa" w:w="1417"/>
+            <w:tcBorders>
+              <w:bottom w:val="single" w:sz="12" w:space="0" w:color="000000"/>
+            </w:tcBorders>
+          </w:tcPr>
+          <w:p>
+            <w:pPr>
+              <w:spacing w:after="0" w:line="240" w:lineRule="auto"/>
+              <w:jc w:val="center"/>
+            </w:pPr>
+            <w:r/>
+            <w:r>
+              <w:rPr>
+                <w:sz w:val="15"/>
               </w:rPr>
               <w:t>1.00 (0.98–1.03)</w:t>
             </w:r>
@@ -8536,7 +9267,7 @@
         <w:rPr>
           <w:sz w:val="16"/>
         </w:rPr>
-        <w:t>Same complete-case sample for all models (colon polyp: 240,720 participants, 13,822 events; stomach/duodenal polyp: 241,891, 6,370). Model 1: age, sex, Townsend deprivation index, body mass index, systolic and diastolic blood pressure, smoking and alcohol drinking. Model 3: Model 1 plus prior hospital diagnoses (log number of ICD-10 codes; disorders of lipoprotein metabolism, ischaemic heart disease, hypertension, diabetes, reflux disease, gastritis or ulcer). Model 4: Model 3 plus waist circumference, body fat percentage, HbA1c and C-reactive protein. Metabolites were rank-normalised and standardised. Bold: P &lt; 0.05 after Bonferroni correction across 251 metabolites. Results for all 251 metabolites are in Table S1 and Figure 3.</w:t>
+        <w:t>Same complete-case sample for all models (colon polyp: 240,720 participants, 13,822 events; stomach/duodenal polyp: 241,891, 6,370). Model 1: age, sex, Townsend deprivation index, body mass index, systolic and diastolic blood pressure, smoking and alcohol drinking. Model 2: Model 1 plus waist circumference, body fat percentage, HbA1c and C-reactive protein. Model 3: Model 1 plus prior hospital diagnoses (log number of ICD-10 codes; disorders of lipoprotein metabolism, ischaemic heart disease, hypertension, diabetes, reflux disease, gastritis or ulcer). Model 4: Models 2 and 3 combined. Metabolites were rank-normalised and standardised. Bold: P &lt; 0.05 after Bonferroni correction across 251 metabolites. Results for all 251 metabolites are in Table S1 and Figure 3.</w:t>
       </w:r>
     </w:p>
     <w:p>

</xml_diff>